<commit_message>
중2 파트 CHECK·전문문제 출제경향 기준 재제작(어휘33·어법32·대화30·리딩17 / 전문문제 20×3) + 풀버전·Word 재생성, 중1 전문문제 신규(어휘·어법·대화 20) Co-Authored-By: Claude Opus 5.5 <noreply@anthropic.com> Claude-Session: https://claude.ai/code/session_01AjdhxpgqAd1VDz33VKqymS
</commit_message>
<xml_diff>
--- a/mokdong2/2fin/word/md2s2_dialogue_test_exam.docx
+++ b/mokdong2/2fin/word/md2s2_dialogue_test_exam.docx
@@ -55,7 +55,7 @@
           <w:sz w:val="17"/>
           <w:u w:val="none"/>
         </w:rPr>
-        <w:t>배점: 4점 6문항(3·7·10·14·17·18번) / 3점 14문항 · 「있는 대로」 복수정답 3문항(3·10·14번) · 서술형 4문항(5·16·17·18번)</w:t>
+        <w:t>배점: 4점 6문항(2·7·8·11·15·20번) / 3점 14문항 · 「있는 대로」 복수정답 3문항(2·8·15번) · 서술형 5문항(4·11·12·18·20번)</w:t>
       </w:r>
     </w:p>
     <w:p>
@@ -70,7 +70,184 @@
           <w:sz w:val="21"/>
           <w:u w:val="none"/>
         </w:rPr>
-        <w:t>■ [1~10] Lesson 5 — 교통수단·길 묻기 · 소요 시간 묻기</w:t>
+        <w:t>■ [1~4] 다음 대화를 읽고 물음에 답하시오. (L5 Liam &amp; Somi)</w:t>
+      </w:r>
+    </w:p>
+    <w:p>
+      <w:pPr>
+        <w:spacing w:after="60"/>
+        <w:pBdr>
+          <w:top w:val="single" w:sz="4" w:space="3" w:color="9AA9C2"/>
+          <w:left w:val="single" w:sz="4" w:space="3" w:color="9AA9C2"/>
+          <w:bottom w:val="single" w:sz="4" w:space="3" w:color="9AA9C2"/>
+          <w:right w:val="single" w:sz="4" w:space="3" w:color="9AA9C2"/>
+        </w:pBdr>
+        <w:ind w:left="57" w:right="57"/>
+      </w:pPr>
+      <w:r>
+        <w:rPr>
+          <w:b w:val="0"/>
+          <w:i w:val="0"/>
+          <w:sz w:val="20"/>
+          <w:u w:val="none"/>
+        </w:rPr>
+        <w:t xml:space="preserve">B: Somi, I need help. What's the </w:t>
+      </w:r>
+      <w:r>
+        <w:rPr>
+          <w:b/>
+          <w:i w:val="0"/>
+          <w:sz w:val="20"/>
+          <w:u w:val="none"/>
+        </w:rPr>
+        <w:t>(A)</w:t>
+      </w:r>
+      <w:r>
+        <w:rPr>
+          <w:b w:val="0"/>
+          <w:i w:val="0"/>
+          <w:sz w:val="20"/>
+          <w:u w:val="none"/>
+        </w:rPr>
+        <w:t xml:space="preserve"> ____________ to Sebit Park from here?</w:t>
+      </w:r>
+      <w:r>
+        <w:br/>
+      </w:r>
+      <w:r>
+        <w:rPr>
+          <w:b w:val="0"/>
+          <w:i w:val="0"/>
+          <w:sz w:val="20"/>
+          <w:u w:val="none"/>
+        </w:rPr>
+        <w:t>G: Sebit Park? Well, you can get there by bus or by subway, but the subway is better.</w:t>
+      </w:r>
+      <w:r>
+        <w:br/>
+      </w:r>
+      <w:r>
+        <w:rPr>
+          <w:b w:val="0"/>
+          <w:i w:val="0"/>
+          <w:sz w:val="20"/>
+          <w:u w:val="none"/>
+        </w:rPr>
+        <w:t xml:space="preserve">B: OK. </w:t>
+      </w:r>
+      <w:r>
+        <w:rPr>
+          <w:b/>
+          <w:i w:val="0"/>
+          <w:sz w:val="20"/>
+          <w:u w:val="none"/>
+        </w:rPr>
+        <w:t>(B)</w:t>
+      </w:r>
+      <w:r>
+        <w:rPr>
+          <w:b w:val="0"/>
+          <w:i w:val="0"/>
+          <w:sz w:val="20"/>
+          <w:u w:val="none"/>
+        </w:rPr>
+        <w:t xml:space="preserve"> ____________________</w:t>
+      </w:r>
+      <w:r>
+        <w:br/>
+      </w:r>
+      <w:r>
+        <w:rPr>
+          <w:b w:val="0"/>
+          <w:i w:val="0"/>
+          <w:sz w:val="20"/>
+          <w:u w:val="none"/>
+        </w:rPr>
+        <w:t>G: Take line 3, and get off at Sebit Station.</w:t>
+      </w:r>
+      <w:r>
+        <w:br/>
+      </w:r>
+      <w:r>
+        <w:rPr>
+          <w:b w:val="0"/>
+          <w:i w:val="0"/>
+          <w:sz w:val="20"/>
+          <w:u w:val="none"/>
+        </w:rPr>
+        <w:t>B: Line 3 and get off at Sebit Station. How long will it take?</w:t>
+      </w:r>
+      <w:r>
+        <w:br/>
+      </w:r>
+      <w:r>
+        <w:rPr>
+          <w:b w:val="0"/>
+          <w:i w:val="0"/>
+          <w:sz w:val="20"/>
+          <w:u w:val="none"/>
+        </w:rPr>
+        <w:t>G: It'll take about 40 minutes.</w:t>
+      </w:r>
+      <w:r>
+        <w:br/>
+      </w:r>
+      <w:r>
+        <w:rPr>
+          <w:b w:val="0"/>
+          <w:i w:val="0"/>
+          <w:sz w:val="20"/>
+          <w:u w:val="none"/>
+        </w:rPr>
+        <w:t>B: Is it that far?</w:t>
+      </w:r>
+      <w:r>
+        <w:br/>
+      </w:r>
+      <w:r>
+        <w:rPr>
+          <w:b w:val="0"/>
+          <w:i w:val="0"/>
+          <w:sz w:val="20"/>
+          <w:u w:val="none"/>
+        </w:rPr>
+        <w:t>G: Yes. Anyway, why are you going to Sebit Park, Liam?</w:t>
+      </w:r>
+      <w:r>
+        <w:br/>
+      </w:r>
+      <w:r>
+        <w:rPr>
+          <w:b w:val="0"/>
+          <w:i w:val="0"/>
+          <w:sz w:val="20"/>
+          <w:u w:val="none"/>
+        </w:rPr>
+        <w:t>B: Oh, there is an art fair this Saturday. You can come with me if you want.</w:t>
+      </w:r>
+      <w:r>
+        <w:br/>
+      </w:r>
+      <w:r>
+        <w:rPr>
+          <w:b w:val="0"/>
+          <w:i w:val="0"/>
+          <w:sz w:val="20"/>
+          <w:u w:val="none"/>
+        </w:rPr>
+        <w:t>G: Really? I'm free this Saturday. Let's go together.</w:t>
+      </w:r>
+      <w:r>
+        <w:br/>
+      </w:r>
+      <w:r>
+        <w:rPr>
+          <w:b w:val="0"/>
+          <w:i w:val="0"/>
+          <w:sz w:val="20"/>
+          <w:u w:val="none"/>
+        </w:rPr>
+        <w:t>B: Perfect. Let's meet here at 10.</w:t>
       </w:r>
     </w:p>
     <w:p>
@@ -94,7 +271,367 @@
           <w:sz w:val="20"/>
           <w:u w:val="none"/>
         </w:rPr>
-        <w:t xml:space="preserve">[1~5] 다음 대화를 읽고 물음에 답하시오. — 1. 빈칸 (A)에 들어갈 말로 알맞은 것은? </w:t>
+        <w:t xml:space="preserve">위 대화의 빈칸 (A), (B)에 들어갈 말이 바르게 짝지어진 것은? </w:t>
+      </w:r>
+      <w:r>
+        <w:rPr>
+          <w:b w:val="0"/>
+          <w:i w:val="0"/>
+          <w:sz w:val="20"/>
+          <w:u w:val="none"/>
+        </w:rPr>
+        <w:t>(3점)</w:t>
+      </w:r>
+    </w:p>
+    <w:p>
+      <w:pPr>
+        <w:spacing w:after="10"/>
+        <w:ind w:left="170"/>
+      </w:pPr>
+      <w:r>
+        <w:rPr>
+          <w:b w:val="0"/>
+          <w:i w:val="0"/>
+          <w:sz w:val="20"/>
+          <w:u w:val="none"/>
+        </w:rPr>
+        <w:t>① best way to get — Which line should I take?</w:t>
+      </w:r>
+    </w:p>
+    <w:p>
+      <w:pPr>
+        <w:spacing w:after="10"/>
+        <w:ind w:left="170"/>
+      </w:pPr>
+      <w:r>
+        <w:rPr>
+          <w:b w:val="0"/>
+          <w:i w:val="0"/>
+          <w:sz w:val="20"/>
+          <w:u w:val="none"/>
+        </w:rPr>
+        <w:t>② best way getting — Which line should I take?</w:t>
+      </w:r>
+    </w:p>
+    <w:p>
+      <w:pPr>
+        <w:spacing w:after="10"/>
+        <w:ind w:left="170"/>
+      </w:pPr>
+      <w:r>
+        <w:rPr>
+          <w:b w:val="0"/>
+          <w:i w:val="0"/>
+          <w:sz w:val="20"/>
+          <w:u w:val="none"/>
+        </w:rPr>
+        <w:t>③ best way to get — Which bus should I take?</w:t>
+      </w:r>
+    </w:p>
+    <w:p>
+      <w:pPr>
+        <w:spacing w:after="10"/>
+        <w:ind w:left="170"/>
+      </w:pPr>
+      <w:r>
+        <w:rPr>
+          <w:b w:val="0"/>
+          <w:i w:val="0"/>
+          <w:sz w:val="20"/>
+          <w:u w:val="none"/>
+        </w:rPr>
+        <w:t>④ way best to get — How long will it take?</w:t>
+      </w:r>
+    </w:p>
+    <w:p>
+      <w:pPr>
+        <w:spacing w:after="10"/>
+        <w:ind w:left="170"/>
+      </w:pPr>
+      <w:r>
+        <w:rPr>
+          <w:b w:val="0"/>
+          <w:i w:val="0"/>
+          <w:sz w:val="20"/>
+          <w:u w:val="none"/>
+        </w:rPr>
+        <w:t>⑤ best way to get — When should I leave?</w:t>
+      </w:r>
+    </w:p>
+    <w:p>
+      <w:pPr>
+        <w:spacing w:after="20" w:before="50"/>
+      </w:pPr>
+      <w:r>
+        <w:rPr>
+          <w:b/>
+          <w:i w:val="0"/>
+          <w:color w:val="1F3864"/>
+          <w:sz w:val="20"/>
+          <w:u w:val="none"/>
+        </w:rPr>
+        <w:t xml:space="preserve">2. </w:t>
+      </w:r>
+      <w:r>
+        <w:rPr>
+          <w:b w:val="0"/>
+          <w:i w:val="0"/>
+          <w:sz w:val="20"/>
+          <w:u w:val="none"/>
+        </w:rPr>
+        <w:t xml:space="preserve">위 대화의 내용과 일치하는 것을 </w:t>
+      </w:r>
+      <w:r>
+        <w:rPr>
+          <w:b/>
+          <w:i w:val="0"/>
+          <w:sz w:val="20"/>
+          <w:u w:val="none"/>
+        </w:rPr>
+        <w:t>있는 대로</w:t>
+      </w:r>
+      <w:r>
+        <w:rPr>
+          <w:b w:val="0"/>
+          <w:i w:val="0"/>
+          <w:sz w:val="20"/>
+          <w:u w:val="none"/>
+        </w:rPr>
+        <w:t xml:space="preserve"> 고르면? </w:t>
+      </w:r>
+      <w:r>
+        <w:rPr>
+          <w:b w:val="0"/>
+          <w:i w:val="0"/>
+          <w:sz w:val="20"/>
+          <w:u w:val="none"/>
+        </w:rPr>
+        <w:t>(4점)</w:t>
+      </w:r>
+    </w:p>
+    <w:p>
+      <w:pPr>
+        <w:spacing w:after="10"/>
+        <w:ind w:left="170"/>
+      </w:pPr>
+      <w:r>
+        <w:rPr>
+          <w:b w:val="0"/>
+          <w:i w:val="0"/>
+          <w:sz w:val="20"/>
+          <w:u w:val="none"/>
+        </w:rPr>
+        <w:t>① 소미는 버스보다 지하철로 가는 것이 더 낫다고 말했다.</w:t>
+      </w:r>
+    </w:p>
+    <w:p>
+      <w:pPr>
+        <w:spacing w:after="10"/>
+        <w:ind w:left="170"/>
+      </w:pPr>
+      <w:r>
+        <w:rPr>
+          <w:b w:val="0"/>
+          <w:i w:val="0"/>
+          <w:sz w:val="20"/>
+          <w:u w:val="none"/>
+        </w:rPr>
+        <w:t>② Liam은 2호선을 타고 세빛역에서 내려야 한다.</w:t>
+      </w:r>
+    </w:p>
+    <w:p>
+      <w:pPr>
+        <w:spacing w:after="10"/>
+        <w:ind w:left="170"/>
+      </w:pPr>
+      <w:r>
+        <w:rPr>
+          <w:b w:val="0"/>
+          <w:i w:val="0"/>
+          <w:sz w:val="20"/>
+          <w:u w:val="none"/>
+        </w:rPr>
+        <w:t>③ 세빛공원까지는 약 40분이 걸린다.</w:t>
+      </w:r>
+    </w:p>
+    <w:p>
+      <w:pPr>
+        <w:spacing w:after="10"/>
+        <w:ind w:left="170"/>
+      </w:pPr>
+      <w:r>
+        <w:rPr>
+          <w:b w:val="0"/>
+          <w:i w:val="0"/>
+          <w:sz w:val="20"/>
+          <w:u w:val="none"/>
+        </w:rPr>
+        <w:t>④ 미술 박람회는 이번 주 일요일에 열린다.</w:t>
+      </w:r>
+    </w:p>
+    <w:p>
+      <w:pPr>
+        <w:spacing w:after="10"/>
+        <w:ind w:left="170"/>
+      </w:pPr>
+      <w:r>
+        <w:rPr>
+          <w:b w:val="0"/>
+          <w:i w:val="0"/>
+          <w:sz w:val="20"/>
+          <w:u w:val="none"/>
+        </w:rPr>
+        <w:t>⑤ 두 사람은 토요일 10시에 세빛공원에서 만나기로 했다.</w:t>
+      </w:r>
+    </w:p>
+    <w:p>
+      <w:pPr>
+        <w:spacing w:after="20" w:before="50"/>
+      </w:pPr>
+      <w:r>
+        <w:rPr>
+          <w:b/>
+          <w:i w:val="0"/>
+          <w:color w:val="1F3864"/>
+          <w:sz w:val="20"/>
+          <w:u w:val="none"/>
+        </w:rPr>
+        <w:t xml:space="preserve">3. </w:t>
+      </w:r>
+      <w:r>
+        <w:rPr>
+          <w:b w:val="0"/>
+          <w:i w:val="0"/>
+          <w:sz w:val="20"/>
+          <w:u w:val="none"/>
+        </w:rPr>
+        <w:t xml:space="preserve">위 대화를 읽고 답할 수 </w:t>
+      </w:r>
+      <w:r>
+        <w:rPr>
+          <w:b/>
+          <w:i w:val="0"/>
+          <w:sz w:val="20"/>
+          <w:u w:val="none"/>
+        </w:rPr>
+        <w:t>없는</w:t>
+      </w:r>
+      <w:r>
+        <w:rPr>
+          <w:b w:val="0"/>
+          <w:i w:val="0"/>
+          <w:sz w:val="20"/>
+          <w:u w:val="none"/>
+        </w:rPr>
+        <w:t xml:space="preserve"> 질문은? </w:t>
+      </w:r>
+      <w:r>
+        <w:rPr>
+          <w:b w:val="0"/>
+          <w:i w:val="0"/>
+          <w:sz w:val="20"/>
+          <w:u w:val="none"/>
+        </w:rPr>
+        <w:t>(3점)</w:t>
+      </w:r>
+    </w:p>
+    <w:p>
+      <w:pPr>
+        <w:spacing w:after="10"/>
+        <w:ind w:left="170"/>
+      </w:pPr>
+      <w:r>
+        <w:rPr>
+          <w:b w:val="0"/>
+          <w:i w:val="0"/>
+          <w:sz w:val="20"/>
+          <w:u w:val="none"/>
+        </w:rPr>
+        <w:t>① Which is better to get to Sebit Park, the bus or the subway?</w:t>
+      </w:r>
+    </w:p>
+    <w:p>
+      <w:pPr>
+        <w:spacing w:after="10"/>
+        <w:ind w:left="170"/>
+      </w:pPr>
+      <w:r>
+        <w:rPr>
+          <w:b w:val="0"/>
+          <w:i w:val="0"/>
+          <w:sz w:val="20"/>
+          <w:u w:val="none"/>
+        </w:rPr>
+        <w:t>② Where should Liam get off?</w:t>
+      </w:r>
+    </w:p>
+    <w:p>
+      <w:pPr>
+        <w:spacing w:after="10"/>
+        <w:ind w:left="170"/>
+      </w:pPr>
+      <w:r>
+        <w:rPr>
+          <w:b w:val="0"/>
+          <w:i w:val="0"/>
+          <w:sz w:val="20"/>
+          <w:u w:val="none"/>
+        </w:rPr>
+        <w:t>③ How much does it cost to go to Sebit Park by subway?</w:t>
+      </w:r>
+    </w:p>
+    <w:p>
+      <w:pPr>
+        <w:spacing w:after="10"/>
+        <w:ind w:left="170"/>
+      </w:pPr>
+      <w:r>
+        <w:rPr>
+          <w:b w:val="0"/>
+          <w:i w:val="0"/>
+          <w:sz w:val="20"/>
+          <w:u w:val="none"/>
+        </w:rPr>
+        <w:t>④ Why is Liam going to Sebit Park?</w:t>
+      </w:r>
+    </w:p>
+    <w:p>
+      <w:pPr>
+        <w:spacing w:after="10"/>
+        <w:ind w:left="170"/>
+      </w:pPr>
+      <w:r>
+        <w:rPr>
+          <w:b w:val="0"/>
+          <w:i w:val="0"/>
+          <w:sz w:val="20"/>
+          <w:u w:val="none"/>
+        </w:rPr>
+        <w:t>⑤ What time will Liam and Somi meet?</w:t>
+      </w:r>
+    </w:p>
+    <w:p>
+      <w:pPr>
+        <w:spacing w:after="20" w:before="50"/>
+      </w:pPr>
+      <w:r>
+        <w:rPr>
+          <w:b/>
+          <w:i w:val="0"/>
+          <w:color w:val="1F3864"/>
+          <w:sz w:val="20"/>
+          <w:u w:val="none"/>
+        </w:rPr>
+        <w:t xml:space="preserve">4. </w:t>
+      </w:r>
+      <w:r>
+        <w:rPr>
+          <w:b w:val="0"/>
+          <w:i w:val="0"/>
+          <w:sz w:val="20"/>
+          <w:u w:val="none"/>
+        </w:rPr>
+        <w:t xml:space="preserve">위 대화를 읽고 다음 질문에 대한 답을 완전한 영어 문장으로 쓰시오. (Because로 시작하고 this Saturday를 포함할 것) </w:t>
       </w:r>
       <w:r>
         <w:rPr>
@@ -125,52 +662,7 @@
           <w:sz w:val="20"/>
           <w:u w:val="none"/>
         </w:rPr>
-        <w:t>B: Excuse me, (A) ________ can I get to the Star Stadium?</w:t>
-      </w:r>
-      <w:r>
-        <w:br/>
-      </w:r>
-      <w:r>
-        <w:rPr>
-          <w:b w:val="0"/>
-          <w:i w:val="0"/>
-          <w:sz w:val="20"/>
-          <w:u w:val="none"/>
-        </w:rPr>
-        <w:t>G: You can get there by subway. Take line 4, the green line, and get (B) ________ at Hangang Station.</w:t>
-      </w:r>
-      <w:r>
-        <w:br/>
-      </w:r>
-      <w:r>
-        <w:rPr>
-          <w:b w:val="0"/>
-          <w:i w:val="0"/>
-          <w:sz w:val="20"/>
-          <w:u w:val="none"/>
-        </w:rPr>
-        <w:t xml:space="preserve">B: Line 4 and Hangang Station. Got it. </w:t>
-      </w:r>
-      <w:r>
-        <w:rPr>
-          <w:b w:val="0"/>
-          <w:i w:val="0"/>
-          <w:sz w:val="20"/>
-          <w:u w:val="single"/>
-        </w:rPr>
-        <w:t>(C) 얼마나 걸릴까요?</w:t>
-      </w:r>
-      <w:r>
-        <w:br/>
-      </w:r>
-      <w:r>
-        <w:rPr>
-          <w:b w:val="0"/>
-          <w:i w:val="0"/>
-          <w:sz w:val="20"/>
-          <w:u w:val="none"/>
-        </w:rPr>
-        <w:t>G: A little more than 30 minutes.</w:t>
+        <w:t>Q: Why is Liam going to Sebit Park?</w:t>
       </w:r>
     </w:p>
     <w:p>
@@ -185,7 +677,22 @@
           <w:sz w:val="20"/>
           <w:u w:val="none"/>
         </w:rPr>
-        <w:t>① what    ② how    ③ where    ④ when    ⑤ why</w:t>
+        <w:t>A: Because ________________________________________.</w:t>
+      </w:r>
+    </w:p>
+    <w:p>
+      <w:pPr>
+        <w:spacing w:after="30" w:before="100"/>
+      </w:pPr>
+      <w:r>
+        <w:rPr>
+          <w:b/>
+          <w:i w:val="0"/>
+          <w:color w:val="1F3864"/>
+          <w:sz w:val="21"/>
+          <w:u w:val="none"/>
+        </w:rPr>
+        <w:t>■ [5~8] L5 Listen &amp; Talk — 교통수단·길 묻기·소요 시간</w:t>
       </w:r>
     </w:p>
     <w:p>
@@ -200,7 +707,7 @@
           <w:sz w:val="20"/>
           <w:u w:val="none"/>
         </w:rPr>
-        <w:t xml:space="preserve">2. </w:t>
+        <w:t xml:space="preserve">5. </w:t>
       </w:r>
       <w:r>
         <w:rPr>
@@ -209,7 +716,16 @@
           <w:sz w:val="20"/>
           <w:u w:val="none"/>
         </w:rPr>
-        <w:t xml:space="preserve">위 대화의 빈칸 (B)에 들어갈 말로 알맞은 것은? </w:t>
+        <w:t xml:space="preserve">다음 대화의 빈칸에 들어갈 말로 알맞지 </w:t>
+      </w:r>
+      <w:r>
+        <w:rPr>
+          <w:b/>
+          <w:i w:val="0"/>
+          <w:sz w:val="20"/>
+          <w:u w:val="none"/>
+        </w:rPr>
+        <w:t>않은</w:t>
       </w:r>
       <w:r>
         <w:rPr>
@@ -218,280 +734,7 @@
           <w:sz w:val="20"/>
           <w:u w:val="none"/>
         </w:rPr>
-        <w:t>(3점)</w:t>
-      </w:r>
-    </w:p>
-    <w:p>
-      <w:pPr>
-        <w:spacing w:after="30"/>
-        <w:ind w:left="170"/>
-      </w:pPr>
-      <w:r>
-        <w:rPr>
-          <w:b w:val="0"/>
-          <w:i w:val="0"/>
-          <w:sz w:val="20"/>
-          <w:u w:val="none"/>
-        </w:rPr>
-        <w:t>① on    ② off    ③ in    ④ up    ⑤ out</w:t>
-      </w:r>
-    </w:p>
-    <w:p>
-      <w:pPr>
-        <w:spacing w:after="20" w:before="50"/>
-      </w:pPr>
-      <w:r>
-        <w:rPr>
-          <w:b/>
-          <w:i w:val="0"/>
-          <w:color w:val="1F3864"/>
-          <w:sz w:val="20"/>
-          <w:u w:val="none"/>
-        </w:rPr>
-        <w:t xml:space="preserve">3. </w:t>
-      </w:r>
-      <w:r>
-        <w:rPr>
-          <w:b w:val="0"/>
-          <w:i w:val="0"/>
-          <w:sz w:val="20"/>
-          <w:u w:val="none"/>
-        </w:rPr>
-        <w:t xml:space="preserve">위 대화의 밑줄 친 (C)를 영어로 옮긴 것으로 알맞은 것을 </w:t>
-      </w:r>
-      <w:r>
-        <w:rPr>
-          <w:b/>
-          <w:i w:val="0"/>
-          <w:sz w:val="20"/>
-          <w:u w:val="none"/>
-        </w:rPr>
-        <w:t>있는 대로</w:t>
-      </w:r>
-      <w:r>
-        <w:rPr>
-          <w:b w:val="0"/>
-          <w:i w:val="0"/>
-          <w:sz w:val="20"/>
-          <w:u w:val="none"/>
-        </w:rPr>
-        <w:t xml:space="preserve"> 고르면? </w:t>
-      </w:r>
-      <w:r>
-        <w:rPr>
-          <w:b w:val="0"/>
-          <w:i w:val="0"/>
-          <w:sz w:val="20"/>
-          <w:u w:val="none"/>
-        </w:rPr>
-        <w:t>(4점)</w:t>
-      </w:r>
-    </w:p>
-    <w:p>
-      <w:pPr>
-        <w:spacing w:after="10"/>
-        <w:ind w:left="170"/>
-      </w:pPr>
-      <w:r>
-        <w:rPr>
-          <w:b w:val="0"/>
-          <w:i w:val="0"/>
-          <w:sz w:val="20"/>
-          <w:u w:val="none"/>
-        </w:rPr>
-        <w:t>① How long will it take?</w:t>
-      </w:r>
-    </w:p>
-    <w:p>
-      <w:pPr>
-        <w:spacing w:after="10"/>
-        <w:ind w:left="170"/>
-      </w:pPr>
-      <w:r>
-        <w:rPr>
-          <w:b w:val="0"/>
-          <w:i w:val="0"/>
-          <w:sz w:val="20"/>
-          <w:u w:val="none"/>
-        </w:rPr>
-        <w:t>② How long does it take?</w:t>
-      </w:r>
-    </w:p>
-    <w:p>
-      <w:pPr>
-        <w:spacing w:after="10"/>
-        <w:ind w:left="170"/>
-      </w:pPr>
-      <w:r>
-        <w:rPr>
-          <w:b w:val="0"/>
-          <w:i w:val="0"/>
-          <w:sz w:val="20"/>
-          <w:u w:val="none"/>
-        </w:rPr>
-        <w:t>③ How far will it take?</w:t>
-      </w:r>
-    </w:p>
-    <w:p>
-      <w:pPr>
-        <w:spacing w:after="10"/>
-        <w:ind w:left="170"/>
-      </w:pPr>
-      <w:r>
-        <w:rPr>
-          <w:b w:val="0"/>
-          <w:i w:val="0"/>
-          <w:sz w:val="20"/>
-          <w:u w:val="none"/>
-        </w:rPr>
-        <w:t>④ How much will it take?</w:t>
-      </w:r>
-    </w:p>
-    <w:p>
-      <w:pPr>
-        <w:spacing w:after="10"/>
-        <w:ind w:left="170"/>
-      </w:pPr>
-      <w:r>
-        <w:rPr>
-          <w:b w:val="0"/>
-          <w:i w:val="0"/>
-          <w:sz w:val="20"/>
-          <w:u w:val="none"/>
-        </w:rPr>
-        <w:t>⑤ How many will it take?</w:t>
-      </w:r>
-    </w:p>
-    <w:p>
-      <w:pPr>
-        <w:spacing w:after="20" w:before="50"/>
-      </w:pPr>
-      <w:r>
-        <w:rPr>
-          <w:b/>
-          <w:i w:val="0"/>
-          <w:color w:val="1F3864"/>
-          <w:sz w:val="20"/>
-          <w:u w:val="none"/>
-        </w:rPr>
-        <w:t xml:space="preserve">4. </w:t>
-      </w:r>
-      <w:r>
-        <w:rPr>
-          <w:b w:val="0"/>
-          <w:i w:val="0"/>
-          <w:sz w:val="20"/>
-          <w:u w:val="none"/>
-        </w:rPr>
-        <w:t xml:space="preserve">위 대화의 내용과 일치하는 것은? </w:t>
-      </w:r>
-      <w:r>
-        <w:rPr>
-          <w:b w:val="0"/>
-          <w:i w:val="0"/>
-          <w:sz w:val="20"/>
-          <w:u w:val="none"/>
-        </w:rPr>
-        <w:t>(3점)</w:t>
-      </w:r>
-    </w:p>
-    <w:p>
-      <w:pPr>
-        <w:spacing w:after="10"/>
-        <w:ind w:left="170"/>
-      </w:pPr>
-      <w:r>
-        <w:rPr>
-          <w:b w:val="0"/>
-          <w:i w:val="0"/>
-          <w:sz w:val="20"/>
-          <w:u w:val="none"/>
-        </w:rPr>
-        <w:t>① B는 버스를 타야 한다.</w:t>
-      </w:r>
-    </w:p>
-    <w:p>
-      <w:pPr>
-        <w:spacing w:after="10"/>
-        <w:ind w:left="170"/>
-      </w:pPr>
-      <w:r>
-        <w:rPr>
-          <w:b w:val="0"/>
-          <w:i w:val="0"/>
-          <w:sz w:val="20"/>
-          <w:u w:val="none"/>
-        </w:rPr>
-        <w:t>② 4호선은 빨간색 노선이다.</w:t>
-      </w:r>
-    </w:p>
-    <w:p>
-      <w:pPr>
-        <w:spacing w:after="10"/>
-        <w:ind w:left="170"/>
-      </w:pPr>
-      <w:r>
-        <w:rPr>
-          <w:b w:val="0"/>
-          <w:i w:val="0"/>
-          <w:sz w:val="20"/>
-          <w:u w:val="none"/>
-        </w:rPr>
-        <w:t>③ 한강역에서 내려야 한다.</w:t>
-      </w:r>
-    </w:p>
-    <w:p>
-      <w:pPr>
-        <w:spacing w:after="10"/>
-        <w:ind w:left="170"/>
-      </w:pPr>
-      <w:r>
-        <w:rPr>
-          <w:b w:val="0"/>
-          <w:i w:val="0"/>
-          <w:sz w:val="20"/>
-          <w:u w:val="none"/>
-        </w:rPr>
-        <w:t>④ 20분 정도 걸린다.</w:t>
-      </w:r>
-    </w:p>
-    <w:p>
-      <w:pPr>
-        <w:spacing w:after="10"/>
-        <w:ind w:left="170"/>
-      </w:pPr>
-      <w:r>
-        <w:rPr>
-          <w:b w:val="0"/>
-          <w:i w:val="0"/>
-          <w:sz w:val="20"/>
-          <w:u w:val="none"/>
-        </w:rPr>
-        <w:t>⑤ G도 스타디움에 간다.</w:t>
-      </w:r>
-    </w:p>
-    <w:p>
-      <w:pPr>
-        <w:spacing w:after="20" w:before="50"/>
-      </w:pPr>
-      <w:r>
-        <w:rPr>
-          <w:b/>
-          <w:i w:val="0"/>
-          <w:color w:val="1F3864"/>
-          <w:sz w:val="20"/>
-          <w:u w:val="none"/>
-        </w:rPr>
-        <w:t xml:space="preserve">5. </w:t>
-      </w:r>
-      <w:r>
-        <w:rPr>
-          <w:b w:val="0"/>
-          <w:i w:val="0"/>
-          <w:sz w:val="20"/>
-          <w:u w:val="none"/>
-        </w:rPr>
-        <w:t xml:space="preserve">다음 우리말을 영어로 쓰시오. (by를 이용할 것) </w:t>
+        <w:t xml:space="preserve"> 것은? </w:t>
       </w:r>
       <w:r>
         <w:rPr>
@@ -522,12 +765,48 @@
           <w:sz w:val="20"/>
           <w:u w:val="none"/>
         </w:rPr>
-        <w:t>당신은 택시를 타고 그곳에 갈 수 있어요.</w:t>
+        <w:t>B: Excuse me, ____________________ the Star Stadium?</w:t>
+      </w:r>
+      <w:r>
+        <w:br/>
+      </w:r>
+      <w:r>
+        <w:rPr>
+          <w:b w:val="0"/>
+          <w:i w:val="0"/>
+          <w:sz w:val="20"/>
+          <w:u w:val="none"/>
+        </w:rPr>
+        <w:t>G: You can get there by subway. Take line 4, the green line, and get off at Hangang Station.</w:t>
+      </w:r>
+      <w:r>
+        <w:br/>
+      </w:r>
+      <w:r>
+        <w:rPr>
+          <w:b w:val="0"/>
+          <w:i w:val="0"/>
+          <w:sz w:val="20"/>
+          <w:u w:val="none"/>
+        </w:rPr>
+        <w:t>B: Line 4 and Hangang Station. Got it. How long will it take?</w:t>
+      </w:r>
+      <w:r>
+        <w:br/>
+      </w:r>
+      <w:r>
+        <w:rPr>
+          <w:b w:val="0"/>
+          <w:i w:val="0"/>
+          <w:sz w:val="20"/>
+          <w:u w:val="none"/>
+        </w:rPr>
+        <w:t>G: A little more than 30 minutes.</w:t>
       </w:r>
     </w:p>
     <w:p>
       <w:pPr>
-        <w:spacing w:after="30"/>
+        <w:spacing w:after="10"/>
         <w:ind w:left="170"/>
       </w:pPr>
       <w:r>
@@ -537,7 +816,67 @@
           <w:sz w:val="20"/>
           <w:u w:val="none"/>
         </w:rPr>
-        <w:t>→ ________________________________</w:t>
+        <w:t>① how can I get to</w:t>
+      </w:r>
+    </w:p>
+    <w:p>
+      <w:pPr>
+        <w:spacing w:after="10"/>
+        <w:ind w:left="170"/>
+      </w:pPr>
+      <w:r>
+        <w:rPr>
+          <w:b w:val="0"/>
+          <w:i w:val="0"/>
+          <w:sz w:val="20"/>
+          <w:u w:val="none"/>
+        </w:rPr>
+        <w:t>② how do I get to</w:t>
+      </w:r>
+    </w:p>
+    <w:p>
+      <w:pPr>
+        <w:spacing w:after="10"/>
+        <w:ind w:left="170"/>
+      </w:pPr>
+      <w:r>
+        <w:rPr>
+          <w:b w:val="0"/>
+          <w:i w:val="0"/>
+          <w:sz w:val="20"/>
+          <w:u w:val="none"/>
+        </w:rPr>
+        <w:t>③ what's the best way to get to</w:t>
+      </w:r>
+    </w:p>
+    <w:p>
+      <w:pPr>
+        <w:spacing w:after="10"/>
+        <w:ind w:left="170"/>
+      </w:pPr>
+      <w:r>
+        <w:rPr>
+          <w:b w:val="0"/>
+          <w:i w:val="0"/>
+          <w:sz w:val="20"/>
+          <w:u w:val="none"/>
+        </w:rPr>
+        <w:t>④ can you tell me how to get to</w:t>
+      </w:r>
+    </w:p>
+    <w:p>
+      <w:pPr>
+        <w:spacing w:after="10"/>
+        <w:ind w:left="170"/>
+      </w:pPr>
+      <w:r>
+        <w:rPr>
+          <w:b w:val="0"/>
+          <w:i w:val="0"/>
+          <w:sz w:val="20"/>
+          <w:u w:val="none"/>
+        </w:rPr>
+        <w:t>⑤ how long does it take to get to</w:t>
       </w:r>
     </w:p>
     <w:p>
@@ -561,7 +900,7 @@
           <w:sz w:val="20"/>
           <w:u w:val="none"/>
         </w:rPr>
-        <w:t xml:space="preserve">다음 대화의 빈칸에 들어갈 말로 가장 알맞은 것은? </w:t>
+        <w:t xml:space="preserve">다음 주어진 말에 이어질 대화의 순서로 가장 알맞은 것은? </w:t>
       </w:r>
       <w:r>
         <w:rPr>
@@ -592,7 +931,7 @@
           <w:sz w:val="20"/>
           <w:u w:val="none"/>
         </w:rPr>
-        <w:t>A: How can I get to the Dream Shopping Mall from here? Can I walk?</w:t>
+        <w:t>G: Do you need help?</w:t>
       </w:r>
       <w:r>
         <w:br/>
@@ -604,7 +943,43 @@
           <w:sz w:val="20"/>
           <w:u w:val="none"/>
         </w:rPr>
-        <w:t>B: You can, but it's a little far. ________ Take bus No. 12.</w:t>
+        <w:t>(A) You can, but it's a little far. Why don't you go by bus? Take bus No. 12.</w:t>
+      </w:r>
+      <w:r>
+        <w:br/>
+      </w:r>
+      <w:r>
+        <w:rPr>
+          <w:b w:val="0"/>
+          <w:i w:val="0"/>
+          <w:sz w:val="20"/>
+          <w:u w:val="none"/>
+        </w:rPr>
+        <w:t>(B) Not very long. It'll take less than 10 minutes.</w:t>
+      </w:r>
+      <w:r>
+        <w:br/>
+      </w:r>
+      <w:r>
+        <w:rPr>
+          <w:b w:val="0"/>
+          <w:i w:val="0"/>
+          <w:sz w:val="20"/>
+          <w:u w:val="none"/>
+        </w:rPr>
+        <w:t>(C) Yes. How can I get to the Dream Shopping Mall from here? Can I walk?</w:t>
+      </w:r>
+      <w:r>
+        <w:br/>
+      </w:r>
+      <w:r>
+        <w:rPr>
+          <w:b w:val="0"/>
+          <w:i w:val="0"/>
+          <w:sz w:val="20"/>
+          <w:u w:val="none"/>
+        </w:rPr>
+        <w:t>(D) OK. How long will it take by bus?</w:t>
       </w:r>
     </w:p>
     <w:p>
@@ -619,7 +994,7 @@
           <w:sz w:val="20"/>
           <w:u w:val="none"/>
         </w:rPr>
-        <w:t>① Why don't you go by bus?</w:t>
+        <w:t>① (A)-(C)-(D)-(B)</w:t>
       </w:r>
     </w:p>
     <w:p>
@@ -634,7 +1009,7 @@
           <w:sz w:val="20"/>
           <w:u w:val="none"/>
         </w:rPr>
-        <w:t>② Why don't you walk there?</w:t>
+        <w:t>② (C)-(A)-(D)-(B)</w:t>
       </w:r>
     </w:p>
     <w:p>
@@ -649,7 +1024,7 @@
           <w:sz w:val="20"/>
           <w:u w:val="none"/>
         </w:rPr>
-        <w:t>③ How long will it take?</w:t>
+        <w:t>③ (C)-(D)-(A)-(B)</w:t>
       </w:r>
     </w:p>
     <w:p>
@@ -664,7 +1039,7 @@
           <w:sz w:val="20"/>
           <w:u w:val="none"/>
         </w:rPr>
-        <w:t>④ It's on your right.</w:t>
+        <w:t>④ (C)-(A)-(B)-(D)</w:t>
       </w:r>
     </w:p>
     <w:p>
@@ -679,7 +1054,7 @@
           <w:sz w:val="20"/>
           <w:u w:val="none"/>
         </w:rPr>
-        <w:t>⑤ I'm sorry, I don't know.</w:t>
+        <w:t>⑤ (D)-(A)-(C)-(B)</w:t>
       </w:r>
     </w:p>
     <w:p>
@@ -703,7 +1078,7 @@
           <w:sz w:val="20"/>
           <w:u w:val="none"/>
         </w:rPr>
-        <w:t xml:space="preserve">다음 대화의 순서를 바르게 배열한 것은? </w:t>
+        <w:t xml:space="preserve">다음 대화의 ①~⑤ 중 주어진 문장이 들어가기에 가장 알맞은 곳은? </w:t>
       </w:r>
       <w:r>
         <w:rPr>
@@ -729,12 +1104,27 @@
       </w:pPr>
       <w:r>
         <w:rPr>
+          <w:b/>
+          <w:i w:val="0"/>
+          <w:sz w:val="20"/>
+          <w:u w:val="none"/>
+        </w:rPr>
+        <w:t>It'll be on your right.</w:t>
+      </w:r>
+      <w:r>
+        <w:br/>
+      </w:r>
+      <w:r>
+        <w:br/>
+      </w:r>
+      <w:r>
+        <w:rPr>
           <w:b w:val="0"/>
           <w:i w:val="0"/>
           <w:sz w:val="20"/>
           <w:u w:val="none"/>
         </w:rPr>
-        <w:t>(A) Only about 15 minutes.</w:t>
+        <w:t>B: Excuse me. I'm going to the National Art Museum. ( ① ) What's the best way to get there?</w:t>
       </w:r>
       <w:r>
         <w:br/>
@@ -746,7 +1136,7 @@
           <w:sz w:val="20"/>
           <w:u w:val="none"/>
         </w:rPr>
-        <w:t>(B) You can walk. Go straight for about 500 meters and turn left.</w:t>
+        <w:t>G: You can walk. ( ② ) Go straight for about 500 meters and turn left. ( ③ )</w:t>
       </w:r>
       <w:r>
         <w:br/>
@@ -758,7 +1148,7 @@
           <w:sz w:val="20"/>
           <w:u w:val="none"/>
         </w:rPr>
-        <w:t>(C) Excuse me. What's the best way to get to the National Art Museum?</w:t>
+        <w:t>B: I see. ( ④ ) How long will it take?</w:t>
       </w:r>
       <w:r>
         <w:br/>
@@ -770,7 +1160,103 @@
           <w:sz w:val="20"/>
           <w:u w:val="none"/>
         </w:rPr>
-        <w:t>(D) I see. How long will it take?</w:t>
+        <w:t>G: Only about 15 minutes. ( ⑤ )</w:t>
+      </w:r>
+      <w:r>
+        <w:br/>
+      </w:r>
+      <w:r>
+        <w:rPr>
+          <w:b w:val="0"/>
+          <w:i w:val="0"/>
+          <w:sz w:val="20"/>
+          <w:u w:val="none"/>
+        </w:rPr>
+        <w:t>B: Really? Thanks.</w:t>
+      </w:r>
+    </w:p>
+    <w:p>
+      <w:pPr>
+        <w:spacing w:after="30"/>
+        <w:ind w:left="170"/>
+      </w:pPr>
+      <w:r>
+        <w:rPr>
+          <w:b w:val="0"/>
+          <w:i w:val="0"/>
+          <w:sz w:val="20"/>
+          <w:u w:val="none"/>
+        </w:rPr>
+        <w:t>①    ②    ③    ④    ⑤</w:t>
+      </w:r>
+    </w:p>
+    <w:p>
+      <w:pPr>
+        <w:spacing w:after="20" w:before="50"/>
+      </w:pPr>
+      <w:r>
+        <w:rPr>
+          <w:b/>
+          <w:i w:val="0"/>
+          <w:color w:val="1F3864"/>
+          <w:sz w:val="20"/>
+          <w:u w:val="none"/>
+        </w:rPr>
+        <w:t xml:space="preserve">8. </w:t>
+      </w:r>
+      <w:r>
+        <w:rPr>
+          <w:b w:val="0"/>
+          <w:i w:val="0"/>
+          <w:sz w:val="20"/>
+          <w:u w:val="none"/>
+        </w:rPr>
+        <w:t xml:space="preserve">다음은 L5 대화 표현의 의미를 말한 것이다. 해석을 </w:t>
+      </w:r>
+      <w:r>
+        <w:rPr>
+          <w:b/>
+          <w:i w:val="0"/>
+          <w:sz w:val="20"/>
+          <w:u w:val="none"/>
+        </w:rPr>
+        <w:t>잘못한</w:t>
+      </w:r>
+      <w:r>
+        <w:rPr>
+          <w:b w:val="0"/>
+          <w:i w:val="0"/>
+          <w:sz w:val="20"/>
+          <w:u w:val="none"/>
+        </w:rPr>
+        <w:t xml:space="preserve"> 학생을 </w:t>
+      </w:r>
+      <w:r>
+        <w:rPr>
+          <w:b/>
+          <w:i w:val="0"/>
+          <w:sz w:val="20"/>
+          <w:u w:val="none"/>
+        </w:rPr>
+        <w:t>있는 대로</w:t>
+      </w:r>
+      <w:r>
+        <w:rPr>
+          <w:b w:val="0"/>
+          <w:i w:val="0"/>
+          <w:sz w:val="20"/>
+          <w:u w:val="none"/>
+        </w:rPr>
+        <w:t xml:space="preserve"> 고르면? </w:t>
+      </w:r>
+      <w:r>
+        <w:rPr>
+          <w:b w:val="0"/>
+          <w:i w:val="0"/>
+          <w:sz w:val="20"/>
+          <w:u w:val="none"/>
+        </w:rPr>
+        <w:t>(4점)</w:t>
       </w:r>
     </w:p>
     <w:p>
@@ -785,7 +1271,7 @@
           <w:sz w:val="20"/>
           <w:u w:val="none"/>
         </w:rPr>
-        <w:t>① (C)-(B)-(D)-(A)</w:t>
+        <w:t>① 민수: "Got it."은 ‘알겠어요.’라는 뜻이야.</w:t>
       </w:r>
     </w:p>
     <w:p>
@@ -800,7 +1286,7 @@
           <w:sz w:val="20"/>
           <w:u w:val="none"/>
         </w:rPr>
-        <w:t>② (C)-(D)-(B)-(A)</w:t>
+        <w:t>② 지아: "A little more than 30 minutes."는 ‘30분이 조금 안 걸려요.’라는 뜻이야.</w:t>
       </w:r>
     </w:p>
     <w:p>
@@ -815,7 +1301,7 @@
           <w:sz w:val="20"/>
           <w:u w:val="none"/>
         </w:rPr>
-        <w:t>③ (B)-(C)-(D)-(A)</w:t>
+        <w:t>③ 서준: "Why don't you take a taxi?"는 ‘왜 택시를 타지 않았나요?’라고 이유를 묻는 말이야.</w:t>
       </w:r>
     </w:p>
     <w:p>
@@ -830,7 +1316,7 @@
           <w:sz w:val="20"/>
           <w:u w:val="none"/>
         </w:rPr>
-        <w:t>④ (C)-(A)-(B)-(D)</w:t>
+        <w:t>④ 하린: "It'll take less than 10 minutes."는 ‘10분도 안 걸릴 거예요.’라는 뜻이야.</w:t>
       </w:r>
     </w:p>
     <w:p>
@@ -845,7 +1331,175 @@
           <w:sz w:val="20"/>
           <w:u w:val="none"/>
         </w:rPr>
-        <w:t>⑤ (D)-(C)-(B)-(A)</w:t>
+        <w:t>⑤ 도윤: "Is it that far?"의 that은 ‘그렇게’라는 뜻이야.</w:t>
+      </w:r>
+    </w:p>
+    <w:p>
+      <w:pPr>
+        <w:spacing w:after="30" w:before="100"/>
+      </w:pPr>
+      <w:r>
+        <w:rPr>
+          <w:b/>
+          <w:i w:val="0"/>
+          <w:color w:val="1F3864"/>
+          <w:sz w:val="21"/>
+          <w:u w:val="none"/>
+        </w:rPr>
+        <w:t>■ [9~12] 다음 대화를 읽고 물음에 답하시오. (L6 Somi &amp; Liam)</w:t>
+      </w:r>
+    </w:p>
+    <w:p>
+      <w:pPr>
+        <w:spacing w:after="60"/>
+        <w:pBdr>
+          <w:top w:val="single" w:sz="4" w:space="3" w:color="9AA9C2"/>
+          <w:left w:val="single" w:sz="4" w:space="3" w:color="9AA9C2"/>
+          <w:bottom w:val="single" w:sz="4" w:space="3" w:color="9AA9C2"/>
+          <w:right w:val="single" w:sz="4" w:space="3" w:color="9AA9C2"/>
+        </w:pBdr>
+        <w:ind w:left="57" w:right="57"/>
+      </w:pPr>
+      <w:r>
+        <w:rPr>
+          <w:b w:val="0"/>
+          <w:i w:val="0"/>
+          <w:sz w:val="20"/>
+          <w:u w:val="none"/>
+        </w:rPr>
+        <w:t>G: Liam, can you please help me? I need to find some books for my homework.</w:t>
+      </w:r>
+      <w:r>
+        <w:br/>
+      </w:r>
+      <w:r>
+        <w:rPr>
+          <w:b w:val="0"/>
+          <w:i w:val="0"/>
+          <w:sz w:val="20"/>
+          <w:u w:val="none"/>
+        </w:rPr>
+        <w:t>B: What kinds of books are you looking for, Somi?</w:t>
+      </w:r>
+      <w:r>
+        <w:br/>
+      </w:r>
+      <w:r>
+        <w:rPr>
+          <w:b w:val="0"/>
+          <w:i w:val="0"/>
+          <w:sz w:val="20"/>
+          <w:u w:val="none"/>
+        </w:rPr>
+        <w:t xml:space="preserve">G: </w:t>
+      </w:r>
+      <w:r>
+        <w:rPr>
+          <w:b/>
+          <w:i w:val="0"/>
+          <w:sz w:val="20"/>
+          <w:u w:val="none"/>
+        </w:rPr>
+        <w:t>(B)</w:t>
+      </w:r>
+      <w:r>
+        <w:rPr>
+          <w:b w:val="0"/>
+          <w:i w:val="0"/>
+          <w:sz w:val="20"/>
+          <w:u w:val="none"/>
+        </w:rPr>
+        <w:t xml:space="preserve"> ____________________________________. I need to write an essay.</w:t>
+      </w:r>
+      <w:r>
+        <w:br/>
+      </w:r>
+      <w:r>
+        <w:rPr>
+          <w:b w:val="0"/>
+          <w:i w:val="0"/>
+          <w:sz w:val="20"/>
+          <w:u w:val="none"/>
+        </w:rPr>
+        <w:t>B: Who do you want to write about?</w:t>
+      </w:r>
+      <w:r>
+        <w:br/>
+      </w:r>
+      <w:r>
+        <w:rPr>
+          <w:b w:val="0"/>
+          <w:i w:val="0"/>
+          <w:sz w:val="20"/>
+          <w:u w:val="none"/>
+        </w:rPr>
+        <w:t xml:space="preserve">G: I was thinking about Dr. Schweitzer, but </w:t>
+      </w:r>
+      <w:r>
+        <w:rPr>
+          <w:b/>
+          <w:i w:val="0"/>
+          <w:sz w:val="20"/>
+          <w:u w:val="none"/>
+        </w:rPr>
+        <w:t>(A)</w:t>
+      </w:r>
+      <w:r>
+        <w:rPr>
+          <w:b w:val="0"/>
+          <w:i w:val="0"/>
+          <w:sz w:val="20"/>
+          <w:u w:val="none"/>
+        </w:rPr>
+        <w:t xml:space="preserve"> ______________ someone else for me?</w:t>
+      </w:r>
+      <w:r>
+        <w:br/>
+      </w:r>
+      <w:r>
+        <w:rPr>
+          <w:b w:val="0"/>
+          <w:i w:val="0"/>
+          <w:sz w:val="20"/>
+          <w:u w:val="none"/>
+        </w:rPr>
+        <w:t>B: What about Audrey Hepburn?</w:t>
+      </w:r>
+      <w:r>
+        <w:br/>
+      </w:r>
+      <w:r>
+        <w:rPr>
+          <w:b w:val="0"/>
+          <w:i w:val="0"/>
+          <w:sz w:val="20"/>
+          <w:u w:val="none"/>
+        </w:rPr>
+        <w:t>G: I know she was a famous actor, but what did she do to help others?</w:t>
+      </w:r>
+      <w:r>
+        <w:br/>
+      </w:r>
+      <w:r>
+        <w:rPr>
+          <w:b w:val="0"/>
+          <w:i w:val="0"/>
+          <w:sz w:val="20"/>
+          <w:u w:val="none"/>
+        </w:rPr>
+        <w:t>B: She did a lot of volunteer work, especially for children.</w:t>
+      </w:r>
+      <w:r>
+        <w:br/>
+      </w:r>
+      <w:r>
+        <w:rPr>
+          <w:b w:val="0"/>
+          <w:i w:val="0"/>
+          <w:sz w:val="20"/>
+          <w:u w:val="none"/>
+        </w:rPr>
+        <w:t>G: Really? Then, I can write about her. Thank you!</w:t>
       </w:r>
     </w:p>
     <w:p>
@@ -860,7 +1514,7 @@
           <w:sz w:val="20"/>
           <w:u w:val="none"/>
         </w:rPr>
-        <w:t xml:space="preserve">8. </w:t>
+        <w:t xml:space="preserve">9. </w:t>
       </w:r>
       <w:r>
         <w:rPr>
@@ -869,25 +1523,7 @@
           <w:sz w:val="20"/>
           <w:u w:val="none"/>
         </w:rPr>
-        <w:t xml:space="preserve">다음 중 길을 묻는 표현이 </w:t>
-      </w:r>
-      <w:r>
-        <w:rPr>
-          <w:b/>
-          <w:i w:val="0"/>
-          <w:sz w:val="20"/>
-          <w:u w:val="none"/>
-        </w:rPr>
-        <w:t>아닌</w:t>
-      </w:r>
-      <w:r>
-        <w:rPr>
-          <w:b w:val="0"/>
-          <w:i w:val="0"/>
-          <w:sz w:val="20"/>
-          <w:u w:val="none"/>
-        </w:rPr>
-        <w:t xml:space="preserve"> 것은? </w:t>
+        <w:t xml:space="preserve">위 대화의 빈칸 (A)에 들어갈 말로 가장 알맞은 것은? </w:t>
       </w:r>
       <w:r>
         <w:rPr>
@@ -911,7 +1547,7 @@
           <w:sz w:val="20"/>
           <w:u w:val="none"/>
         </w:rPr>
-        <w:t>① How do I get to the station?</w:t>
+        <w:t>① can you recommend</w:t>
       </w:r>
     </w:p>
     <w:p>
@@ -926,7 +1562,7 @@
           <w:sz w:val="20"/>
           <w:u w:val="none"/>
         </w:rPr>
-        <w:t>② What's the best way to get there?</w:t>
+        <w:t>② what do you recommend</w:t>
       </w:r>
     </w:p>
     <w:p>
@@ -941,7 +1577,7 @@
           <w:sz w:val="20"/>
           <w:u w:val="none"/>
         </w:rPr>
-        <w:t>③ Can you tell me how to get to the museum?</w:t>
+        <w:t>③ can I recommend</w:t>
       </w:r>
     </w:p>
     <w:p>
@@ -956,7 +1592,7 @@
           <w:sz w:val="20"/>
           <w:u w:val="none"/>
         </w:rPr>
-        <w:t>④ How long will it take?</w:t>
+        <w:t>④ did you recommend</w:t>
       </w:r>
     </w:p>
     <w:p>
@@ -971,7 +1607,7 @@
           <w:sz w:val="20"/>
           <w:u w:val="none"/>
         </w:rPr>
-        <w:t>⑤ How can I go to the cinema?</w:t>
+        <w:t>⑤ how about recommending</w:t>
       </w:r>
     </w:p>
     <w:p>
@@ -986,7 +1622,7 @@
           <w:sz w:val="20"/>
           <w:u w:val="none"/>
         </w:rPr>
-        <w:t xml:space="preserve">9. </w:t>
+        <w:t xml:space="preserve">10. </w:t>
       </w:r>
       <w:r>
         <w:rPr>
@@ -995,7 +1631,7 @@
           <w:sz w:val="20"/>
           <w:u w:val="none"/>
         </w:rPr>
-        <w:t xml:space="preserve">다음 빈칸에 들어갈 말로 알맞은 것은? </w:t>
+        <w:t xml:space="preserve">위 대화의 내용과 일치하는 것은? </w:t>
       </w:r>
       <w:r>
         <w:rPr>
@@ -1005,6 +1641,132 @@
           <w:u w:val="none"/>
         </w:rPr>
         <w:t>(3점)</w:t>
+      </w:r>
+    </w:p>
+    <w:p>
+      <w:pPr>
+        <w:spacing w:after="10"/>
+        <w:ind w:left="170"/>
+      </w:pPr>
+      <w:r>
+        <w:rPr>
+          <w:b w:val="0"/>
+          <w:i w:val="0"/>
+          <w:sz w:val="20"/>
+          <w:u w:val="none"/>
+        </w:rPr>
+        <w:t>① 소미는 Liam의 숙제를 도와주려고 한다.</w:t>
+      </w:r>
+    </w:p>
+    <w:p>
+      <w:pPr>
+        <w:spacing w:after="10"/>
+        <w:ind w:left="170"/>
+      </w:pPr>
+      <w:r>
+        <w:rPr>
+          <w:b w:val="0"/>
+          <w:i w:val="0"/>
+          <w:sz w:val="20"/>
+          <w:u w:val="none"/>
+        </w:rPr>
+        <w:t>② 소미는 처음에 Audrey Hepburn에 대해 쓰려고 했다.</w:t>
+      </w:r>
+    </w:p>
+    <w:p>
+      <w:pPr>
+        <w:spacing w:after="10"/>
+        <w:ind w:left="170"/>
+      </w:pPr>
+      <w:r>
+        <w:rPr>
+          <w:b w:val="0"/>
+          <w:i w:val="0"/>
+          <w:sz w:val="20"/>
+          <w:u w:val="none"/>
+        </w:rPr>
+        <w:t>③ Liam은 Schweitzer 박사를 추천했다.</w:t>
+      </w:r>
+    </w:p>
+    <w:p>
+      <w:pPr>
+        <w:spacing w:after="10"/>
+        <w:ind w:left="170"/>
+      </w:pPr>
+      <w:r>
+        <w:rPr>
+          <w:b w:val="0"/>
+          <w:i w:val="0"/>
+          <w:sz w:val="20"/>
+          <w:u w:val="none"/>
+        </w:rPr>
+        <w:t>④ Audrey Hepburn은 특히 아이들을 위해 많은 자원봉사를 했다.</w:t>
+      </w:r>
+    </w:p>
+    <w:p>
+      <w:pPr>
+        <w:spacing w:after="10"/>
+        <w:ind w:left="170"/>
+      </w:pPr>
+      <w:r>
+        <w:rPr>
+          <w:b w:val="0"/>
+          <w:i w:val="0"/>
+          <w:sz w:val="20"/>
+          <w:u w:val="none"/>
+        </w:rPr>
+        <w:t>⑤ 소미는 결국 Schweitzer 박사에 대해 쓰기로 했다.</w:t>
+      </w:r>
+    </w:p>
+    <w:p>
+      <w:pPr>
+        <w:spacing w:after="20" w:before="50"/>
+      </w:pPr>
+      <w:r>
+        <w:rPr>
+          <w:b/>
+          <w:i w:val="0"/>
+          <w:color w:val="1F3864"/>
+          <w:sz w:val="20"/>
+          <w:u w:val="none"/>
+        </w:rPr>
+        <w:t xml:space="preserve">11. </w:t>
+      </w:r>
+      <w:r>
+        <w:rPr>
+          <w:b w:val="0"/>
+          <w:i w:val="0"/>
+          <w:sz w:val="20"/>
+          <w:u w:val="none"/>
+        </w:rPr>
+        <w:t xml:space="preserve">위 대화의 흐름에 맞게 빈칸 (B)에 들어갈 문장을 〈보기〉의 단어를 </w:t>
+      </w:r>
+      <w:r>
+        <w:rPr>
+          <w:b/>
+          <w:i w:val="0"/>
+          <w:sz w:val="20"/>
+          <w:u w:val="none"/>
+        </w:rPr>
+        <w:t>모두</w:t>
+      </w:r>
+      <w:r>
+        <w:rPr>
+          <w:b w:val="0"/>
+          <w:i w:val="0"/>
+          <w:sz w:val="20"/>
+          <w:u w:val="none"/>
+        </w:rPr>
+        <w:t xml:space="preserve"> 한 번씩 배열하여 완성하시오. </w:t>
+      </w:r>
+      <w:r>
+        <w:rPr>
+          <w:b w:val="0"/>
+          <w:i w:val="0"/>
+          <w:sz w:val="20"/>
+          <w:u w:val="none"/>
+        </w:rPr>
+        <w:t>(4점)</w:t>
       </w:r>
     </w:p>
     <w:p>
@@ -1026,7 +1788,19 @@
           <w:sz w:val="20"/>
           <w:u w:val="none"/>
         </w:rPr>
-        <w:t>You can walk there. = You can get there on ________.</w:t>
+        <w:t>우리말: 나는 다른 사람들을 도운 유명인들에 관한 책을 찾고 있어.</w:t>
+      </w:r>
+      <w:r>
+        <w:br/>
+      </w:r>
+      <w:r>
+        <w:rPr>
+          <w:b w:val="0"/>
+          <w:i w:val="0"/>
+          <w:sz w:val="20"/>
+          <w:u w:val="none"/>
+        </w:rPr>
+        <w:t>〈보기〉 helped / looking / on / famous / for / who / people / books / others</w:t>
       </w:r>
     </w:p>
     <w:p>
@@ -1041,7 +1815,7 @@
           <w:sz w:val="20"/>
           <w:u w:val="none"/>
         </w:rPr>
-        <w:t>① foot    ② feet    ③ walk    ④ bus    ⑤ road</w:t>
+        <w:t>I'm ________________________________________.</w:t>
       </w:r>
     </w:p>
     <w:p>
@@ -1056,7 +1830,7 @@
           <w:sz w:val="20"/>
           <w:u w:val="none"/>
         </w:rPr>
-        <w:t xml:space="preserve">10. </w:t>
+        <w:t xml:space="preserve">12. </w:t>
       </w:r>
       <w:r>
         <w:rPr>
@@ -1065,166 +1839,7 @@
           <w:sz w:val="20"/>
           <w:u w:val="none"/>
         </w:rPr>
-        <w:t xml:space="preserve">두 사람의 대화가 </w:t>
-      </w:r>
-      <w:r>
-        <w:rPr>
-          <w:b/>
-          <w:i w:val="0"/>
-          <w:sz w:val="20"/>
-          <w:u w:val="none"/>
-        </w:rPr>
-        <w:t>어색한</w:t>
-      </w:r>
-      <w:r>
-        <w:rPr>
-          <w:b w:val="0"/>
-          <w:i w:val="0"/>
-          <w:sz w:val="20"/>
-          <w:u w:val="none"/>
-        </w:rPr>
-        <w:t xml:space="preserve"> 것을 </w:t>
-      </w:r>
-      <w:r>
-        <w:rPr>
-          <w:b/>
-          <w:i w:val="0"/>
-          <w:sz w:val="20"/>
-          <w:u w:val="none"/>
-        </w:rPr>
-        <w:t>있는 대로</w:t>
-      </w:r>
-      <w:r>
-        <w:rPr>
-          <w:b w:val="0"/>
-          <w:i w:val="0"/>
-          <w:sz w:val="20"/>
-          <w:u w:val="none"/>
-        </w:rPr>
-        <w:t xml:space="preserve"> 고르면? </w:t>
-      </w:r>
-      <w:r>
-        <w:rPr>
-          <w:b w:val="0"/>
-          <w:i w:val="0"/>
-          <w:sz w:val="20"/>
-          <w:u w:val="none"/>
-        </w:rPr>
-        <w:t>(4점)</w:t>
-      </w:r>
-    </w:p>
-    <w:p>
-      <w:pPr>
-        <w:spacing w:after="10"/>
-        <w:ind w:left="170"/>
-      </w:pPr>
-      <w:r>
-        <w:rPr>
-          <w:b w:val="0"/>
-          <w:i w:val="0"/>
-          <w:sz w:val="20"/>
-          <w:u w:val="none"/>
-        </w:rPr>
-        <w:t>① A: How long will it take? – B: About 20 minutes.</w:t>
-      </w:r>
-    </w:p>
-    <w:p>
-      <w:pPr>
-        <w:spacing w:after="10"/>
-        <w:ind w:left="170"/>
-      </w:pPr>
-      <w:r>
-        <w:rPr>
-          <w:b w:val="0"/>
-          <w:i w:val="0"/>
-          <w:sz w:val="20"/>
-          <w:u w:val="none"/>
-        </w:rPr>
-        <w:t>② A: How can I get to the Sky Cinema? – B: By taxi.</w:t>
-      </w:r>
-    </w:p>
-    <w:p>
-      <w:pPr>
-        <w:spacing w:after="10"/>
-        <w:ind w:left="170"/>
-      </w:pPr>
-      <w:r>
-        <w:rPr>
-          <w:b w:val="0"/>
-          <w:i w:val="0"/>
-          <w:sz w:val="20"/>
-          <w:u w:val="none"/>
-        </w:rPr>
-        <w:t>③ A: Do you need help? – B: Yes. How can I get to the mall?</w:t>
-      </w:r>
-    </w:p>
-    <w:p>
-      <w:pPr>
-        <w:spacing w:after="10"/>
-        <w:ind w:left="170"/>
-      </w:pPr>
-      <w:r>
-        <w:rPr>
-          <w:b w:val="0"/>
-          <w:i w:val="0"/>
-          <w:sz w:val="20"/>
-          <w:u w:val="none"/>
-        </w:rPr>
-        <w:t>④ A: How long will it take? – B: It's about 500 meters.</w:t>
-      </w:r>
-    </w:p>
-    <w:p>
-      <w:pPr>
-        <w:spacing w:after="10"/>
-        <w:ind w:left="170"/>
-      </w:pPr>
-      <w:r>
-        <w:rPr>
-          <w:b w:val="0"/>
-          <w:i w:val="0"/>
-          <w:sz w:val="20"/>
-          <w:u w:val="none"/>
-        </w:rPr>
-        <w:t>⑤ A: Why don't you take a taxi? – B: I took a bus yesterday.</w:t>
-      </w:r>
-    </w:p>
-    <w:p>
-      <w:pPr>
-        <w:spacing w:after="30" w:before="100"/>
-      </w:pPr>
-      <w:r>
-        <w:rPr>
-          <w:b/>
-          <w:i w:val="0"/>
-          <w:color w:val="1F3864"/>
-          <w:sz w:val="21"/>
-          <w:u w:val="none"/>
-        </w:rPr>
-        <w:t>■ [11~17] Lesson 6 — 종류 묻고 답하기 · 추천하기</w:t>
-      </w:r>
-    </w:p>
-    <w:p>
-      <w:pPr>
-        <w:spacing w:after="20" w:before="50"/>
-      </w:pPr>
-      <w:r>
-        <w:rPr>
-          <w:b/>
-          <w:i w:val="0"/>
-          <w:color w:val="1F3864"/>
-          <w:sz w:val="20"/>
-          <w:u w:val="none"/>
-        </w:rPr>
-        <w:t xml:space="preserve">11. </w:t>
-      </w:r>
-      <w:r>
-        <w:rPr>
-          <w:b w:val="0"/>
-          <w:i w:val="0"/>
-          <w:sz w:val="20"/>
-          <w:u w:val="none"/>
-        </w:rPr>
-        <w:t xml:space="preserve">[11~13] 다음 대화를 읽고 물음에 답하시오. — 11. 빈칸 (A)에 들어갈 말로 알맞은 것은? </w:t>
+        <w:t xml:space="preserve">위 대화를 읽고 다음 질문에 대한 답을 완전한 영어 문장으로 쓰시오. (She로 시작할 것) </w:t>
       </w:r>
       <w:r>
         <w:rPr>
@@ -1255,169 +1870,7 @@
           <w:sz w:val="20"/>
           <w:u w:val="none"/>
         </w:rPr>
-        <w:t>B: What kinds of books do you usually read?</w:t>
-      </w:r>
-      <w:r>
-        <w:br/>
-      </w:r>
-      <w:r>
-        <w:rPr>
-          <w:b w:val="0"/>
-          <w:i w:val="0"/>
-          <w:sz w:val="20"/>
-          <w:u w:val="none"/>
-        </w:rPr>
-        <w:t>G: I usually read sci-fi novels.</w:t>
-      </w:r>
-      <w:r>
-        <w:br/>
-      </w:r>
-      <w:r>
-        <w:rPr>
-          <w:b w:val="0"/>
-          <w:i w:val="0"/>
-          <w:sz w:val="20"/>
-          <w:u w:val="none"/>
-        </w:rPr>
-        <w:t>B: Then, (A) ________ a good sci-fi novel for me?</w:t>
-      </w:r>
-      <w:r>
-        <w:br/>
-      </w:r>
-      <w:r>
-        <w:rPr>
-          <w:b w:val="0"/>
-          <w:i w:val="0"/>
-          <w:sz w:val="20"/>
-          <w:u w:val="none"/>
-        </w:rPr>
-        <w:t xml:space="preserve">G: How about </w:t>
-      </w:r>
-      <w:r>
-        <w:rPr>
-          <w:b w:val="0"/>
-          <w:i/>
-          <w:sz w:val="20"/>
-          <w:u w:val="none"/>
-        </w:rPr>
-        <w:t>The Time Machine</w:t>
-      </w:r>
-      <w:r>
-        <w:rPr>
-          <w:b w:val="0"/>
-          <w:i w:val="0"/>
-          <w:sz w:val="20"/>
-          <w:u w:val="none"/>
-        </w:rPr>
-        <w:t>? I think it's the best.</w:t>
-      </w:r>
-    </w:p>
-    <w:p>
-      <w:pPr>
-        <w:spacing w:after="10"/>
-        <w:ind w:left="170"/>
-      </w:pPr>
-      <w:r>
-        <w:rPr>
-          <w:b w:val="0"/>
-          <w:i w:val="0"/>
-          <w:sz w:val="20"/>
-          <w:u w:val="none"/>
-        </w:rPr>
-        <w:t>① can you recommend</w:t>
-      </w:r>
-    </w:p>
-    <w:p>
-      <w:pPr>
-        <w:spacing w:after="10"/>
-        <w:ind w:left="170"/>
-      </w:pPr>
-      <w:r>
-        <w:rPr>
-          <w:b w:val="0"/>
-          <w:i w:val="0"/>
-          <w:sz w:val="20"/>
-          <w:u w:val="none"/>
-        </w:rPr>
-        <w:t>② can I recommend</w:t>
-      </w:r>
-    </w:p>
-    <w:p>
-      <w:pPr>
-        <w:spacing w:after="10"/>
-        <w:ind w:left="170"/>
-      </w:pPr>
-      <w:r>
-        <w:rPr>
-          <w:b w:val="0"/>
-          <w:i w:val="0"/>
-          <w:sz w:val="20"/>
-          <w:u w:val="none"/>
-        </w:rPr>
-        <w:t>③ do you recommend me</w:t>
-      </w:r>
-    </w:p>
-    <w:p>
-      <w:pPr>
-        <w:spacing w:after="10"/>
-        <w:ind w:left="170"/>
-      </w:pPr>
-      <w:r>
-        <w:rPr>
-          <w:b w:val="0"/>
-          <w:i w:val="0"/>
-          <w:sz w:val="20"/>
-          <w:u w:val="none"/>
-        </w:rPr>
-        <w:t>④ what you recommend</w:t>
-      </w:r>
-    </w:p>
-    <w:p>
-      <w:pPr>
-        <w:spacing w:after="10"/>
-        <w:ind w:left="170"/>
-      </w:pPr>
-      <w:r>
-        <w:rPr>
-          <w:b w:val="0"/>
-          <w:i w:val="0"/>
-          <w:sz w:val="20"/>
-          <w:u w:val="none"/>
-        </w:rPr>
-        <w:t>⑤ are you recommend</w:t>
-      </w:r>
-    </w:p>
-    <w:p>
-      <w:pPr>
-        <w:spacing w:after="20" w:before="50"/>
-      </w:pPr>
-      <w:r>
-        <w:rPr>
-          <w:b/>
-          <w:i w:val="0"/>
-          <w:color w:val="1F3864"/>
-          <w:sz w:val="20"/>
-          <w:u w:val="none"/>
-        </w:rPr>
-        <w:t xml:space="preserve">12. </w:t>
-      </w:r>
-      <w:r>
-        <w:rPr>
-          <w:b w:val="0"/>
-          <w:i w:val="0"/>
-          <w:sz w:val="20"/>
-          <w:u w:val="none"/>
-        </w:rPr>
-        <w:t xml:space="preserve">위 대화에서 G가 말한 "How about The Time Machine?"의 의사소통 기능은? </w:t>
-      </w:r>
-      <w:r>
-        <w:rPr>
-          <w:b w:val="0"/>
-          <w:i w:val="0"/>
-          <w:sz w:val="20"/>
-          <w:u w:val="none"/>
-        </w:rPr>
-        <w:t>(3점)</w:t>
+        <w:t>Q: What did Audrey Hepburn do to help others?</w:t>
       </w:r>
     </w:p>
     <w:p>
@@ -1432,7 +1885,22 @@
           <w:sz w:val="20"/>
           <w:u w:val="none"/>
         </w:rPr>
-        <w:t>① 거절하기    ② 제안·추천하기    ③ 감사하기    ④ 길 묻기    ⑤ 사과하기</w:t>
+        <w:t>A: She ________________________________________.</w:t>
+      </w:r>
+    </w:p>
+    <w:p>
+      <w:pPr>
+        <w:spacing w:after="30" w:before="100"/>
+      </w:pPr>
+      <w:r>
+        <w:rPr>
+          <w:b/>
+          <w:i w:val="0"/>
+          <w:color w:val="1F3864"/>
+          <w:sz w:val="21"/>
+          <w:u w:val="none"/>
+        </w:rPr>
+        <w:t>■ [13~18] L6 Listen &amp; Talk — 종류 묻기·추천 요청하기</w:t>
       </w:r>
     </w:p>
     <w:p>
@@ -1456,7 +1924,16 @@
           <w:sz w:val="20"/>
           <w:u w:val="none"/>
         </w:rPr>
-        <w:t xml:space="preserve">위 대화의 내용과 일치하는 것은? </w:t>
+        <w:t xml:space="preserve">다음 대화의 밑줄 친 ⓐ~ⓔ 중 흐름상 </w:t>
+      </w:r>
+      <w:r>
+        <w:rPr>
+          <w:b/>
+          <w:i w:val="0"/>
+          <w:sz w:val="20"/>
+          <w:u w:val="none"/>
+        </w:rPr>
+        <w:t>어색한</w:t>
       </w:r>
       <w:r>
         <w:rPr>
@@ -1465,232 +1942,7 @@
           <w:sz w:val="20"/>
           <w:u w:val="none"/>
         </w:rPr>
-        <w:t>(3점)</w:t>
-      </w:r>
-    </w:p>
-    <w:p>
-      <w:pPr>
-        <w:spacing w:after="10"/>
-        <w:ind w:left="170"/>
-      </w:pPr>
-      <w:r>
-        <w:rPr>
-          <w:b w:val="0"/>
-          <w:i w:val="0"/>
-          <w:sz w:val="20"/>
-          <w:u w:val="none"/>
-        </w:rPr>
-        <w:t>① G는 주로 로맨스 소설을 읽는다.</w:t>
-      </w:r>
-    </w:p>
-    <w:p>
-      <w:pPr>
-        <w:spacing w:after="10"/>
-        <w:ind w:left="170"/>
-      </w:pPr>
-      <w:r>
-        <w:rPr>
-          <w:b w:val="0"/>
-          <w:i w:val="0"/>
-          <w:sz w:val="20"/>
-          <w:u w:val="none"/>
-        </w:rPr>
-        <w:t>② B는 G에게 책을 추천한다.</w:t>
-      </w:r>
-    </w:p>
-    <w:p>
-      <w:pPr>
-        <w:spacing w:after="10"/>
-        <w:ind w:left="170"/>
-      </w:pPr>
-      <w:r>
-        <w:rPr>
-          <w:b w:val="0"/>
-          <w:i w:val="0"/>
-          <w:sz w:val="20"/>
-          <w:u w:val="none"/>
-        </w:rPr>
-        <w:t>③ G는 「타임머신」이 최고라고 생각한다.</w:t>
-      </w:r>
-    </w:p>
-    <w:p>
-      <w:pPr>
-        <w:spacing w:after="10"/>
-        <w:ind w:left="170"/>
-      </w:pPr>
-      <w:r>
-        <w:rPr>
-          <w:b w:val="0"/>
-          <w:i w:val="0"/>
-          <w:sz w:val="20"/>
-          <w:u w:val="none"/>
-        </w:rPr>
-        <w:t>④ B는 공상 과학 소설을 싫어한다.</w:t>
-      </w:r>
-    </w:p>
-    <w:p>
-      <w:pPr>
-        <w:spacing w:after="10"/>
-        <w:ind w:left="170"/>
-      </w:pPr>
-      <w:r>
-        <w:rPr>
-          <w:b w:val="0"/>
-          <w:i w:val="0"/>
-          <w:sz w:val="20"/>
-          <w:u w:val="none"/>
-        </w:rPr>
-        <w:t>⑤ G는 책을 거의 읽지 않는다.</w:t>
-      </w:r>
-    </w:p>
-    <w:p>
-      <w:pPr>
-        <w:spacing w:after="20" w:before="50"/>
-      </w:pPr>
-      <w:r>
-        <w:rPr>
-          <w:b/>
-          <w:i w:val="0"/>
-          <w:color w:val="1F3864"/>
-          <w:sz w:val="20"/>
-          <w:u w:val="none"/>
-        </w:rPr>
-        <w:t xml:space="preserve">14. </w:t>
-      </w:r>
-      <w:r>
-        <w:rPr>
-          <w:b w:val="0"/>
-          <w:i w:val="0"/>
-          <w:sz w:val="20"/>
-          <w:u w:val="none"/>
-        </w:rPr>
-        <w:t xml:space="preserve">다음 중 대화가 자연스러운 것을 </w:t>
-      </w:r>
-      <w:r>
-        <w:rPr>
-          <w:b/>
-          <w:i w:val="0"/>
-          <w:sz w:val="20"/>
-          <w:u w:val="none"/>
-        </w:rPr>
-        <w:t>있는 대로</w:t>
-      </w:r>
-      <w:r>
-        <w:rPr>
-          <w:b w:val="0"/>
-          <w:i w:val="0"/>
-          <w:sz w:val="20"/>
-          <w:u w:val="none"/>
-        </w:rPr>
-        <w:t xml:space="preserve"> 고르면? </w:t>
-      </w:r>
-      <w:r>
-        <w:rPr>
-          <w:b w:val="0"/>
-          <w:i w:val="0"/>
-          <w:sz w:val="20"/>
-          <w:u w:val="none"/>
-        </w:rPr>
-        <w:t>(4점)</w:t>
-      </w:r>
-    </w:p>
-    <w:p>
-      <w:pPr>
-        <w:spacing w:after="10"/>
-        <w:ind w:left="170"/>
-      </w:pPr>
-      <w:r>
-        <w:rPr>
-          <w:b w:val="0"/>
-          <w:i w:val="0"/>
-          <w:sz w:val="20"/>
-          <w:u w:val="none"/>
-        </w:rPr>
-        <w:t>① A: What kinds of movies do you like? – B: I like action movies.</w:t>
-      </w:r>
-    </w:p>
-    <w:p>
-      <w:pPr>
-        <w:spacing w:after="10"/>
-        <w:ind w:left="170"/>
-      </w:pPr>
-      <w:r>
-        <w:rPr>
-          <w:b w:val="0"/>
-          <w:i w:val="0"/>
-          <w:sz w:val="20"/>
-          <w:u w:val="none"/>
-        </w:rPr>
-        <w:t>② A: Can you recommend a soft drink? – B: Try a cherry soda.</w:t>
-      </w:r>
-    </w:p>
-    <w:p>
-      <w:pPr>
-        <w:spacing w:after="10"/>
-        <w:ind w:left="170"/>
-      </w:pPr>
-      <w:r>
-        <w:rPr>
-          <w:b w:val="0"/>
-          <w:i w:val="0"/>
-          <w:sz w:val="20"/>
-          <w:u w:val="none"/>
-        </w:rPr>
-        <w:t>③ A: What kinds of magazines do you have? – B: We have all kinds of magazines.</w:t>
-      </w:r>
-    </w:p>
-    <w:p>
-      <w:pPr>
-        <w:spacing w:after="10"/>
-        <w:ind w:left="170"/>
-      </w:pPr>
-      <w:r>
-        <w:rPr>
-          <w:b w:val="0"/>
-          <w:i w:val="0"/>
-          <w:sz w:val="20"/>
-          <w:u w:val="none"/>
-        </w:rPr>
-        <w:t>④ A: I strongly recommend it. – B: No, thanks. I'll give it a try.</w:t>
-      </w:r>
-    </w:p>
-    <w:p>
-      <w:pPr>
-        <w:spacing w:after="10"/>
-        <w:ind w:left="170"/>
-      </w:pPr>
-      <w:r>
-        <w:rPr>
-          <w:b w:val="0"/>
-          <w:i w:val="0"/>
-          <w:sz w:val="20"/>
-          <w:u w:val="none"/>
-        </w:rPr>
-        <w:t>⑤ A: What kinds of books do you read? – B: Yes, I do.</w:t>
-      </w:r>
-    </w:p>
-    <w:p>
-      <w:pPr>
-        <w:spacing w:after="20" w:before="50"/>
-      </w:pPr>
-      <w:r>
-        <w:rPr>
-          <w:b/>
-          <w:i w:val="0"/>
-          <w:color w:val="1F3864"/>
-          <w:sz w:val="20"/>
-          <w:u w:val="none"/>
-        </w:rPr>
-        <w:t xml:space="preserve">15. </w:t>
-      </w:r>
-      <w:r>
-        <w:rPr>
-          <w:b w:val="0"/>
-          <w:i w:val="0"/>
-          <w:sz w:val="20"/>
-          <w:u w:val="none"/>
-        </w:rPr>
-        <w:t xml:space="preserve">다음 빈칸에 들어갈 말로 알맞은 것은? </w:t>
+        <w:t xml:space="preserve"> 것은? </w:t>
       </w:r>
       <w:r>
         <w:rPr>
@@ -1721,7 +1973,16 @@
           <w:sz w:val="20"/>
           <w:u w:val="none"/>
         </w:rPr>
-        <w:t>A: Try a cherry soda. It's good.</w:t>
+        <w:t>G: ⓐ</w:t>
+      </w:r>
+      <w:r>
+        <w:rPr>
+          <w:b w:val="0"/>
+          <w:i w:val="0"/>
+          <w:sz w:val="20"/>
+          <w:u w:val="single"/>
+        </w:rPr>
+        <w:t>What kinds of soft drinks do you usually have?</w:t>
       </w:r>
       <w:r>
         <w:br/>
@@ -1733,7 +1994,85 @@
           <w:sz w:val="20"/>
           <w:u w:val="none"/>
         </w:rPr>
-        <w:t>B: OK. I'll give it a ________, then.</w:t>
+        <w:t>B: ⓑ</w:t>
+      </w:r>
+      <w:r>
+        <w:rPr>
+          <w:b w:val="0"/>
+          <w:i w:val="0"/>
+          <w:sz w:val="20"/>
+          <w:u w:val="single"/>
+        </w:rPr>
+        <w:t>I usually drink apple soda, and today, I want to drink it again.</w:t>
+      </w:r>
+      <w:r>
+        <w:rPr>
+          <w:b w:val="0"/>
+          <w:i w:val="0"/>
+          <w:sz w:val="20"/>
+          <w:u w:val="none"/>
+        </w:rPr>
+        <w:t xml:space="preserve"> ⓒ</w:t>
+      </w:r>
+      <w:r>
+        <w:rPr>
+          <w:b w:val="0"/>
+          <w:i w:val="0"/>
+          <w:sz w:val="20"/>
+          <w:u w:val="single"/>
+        </w:rPr>
+        <w:t>Can you recommend some new soft drinks?</w:t>
+      </w:r>
+      <w:r>
+        <w:br/>
+      </w:r>
+      <w:r>
+        <w:rPr>
+          <w:b w:val="0"/>
+          <w:i w:val="0"/>
+          <w:sz w:val="20"/>
+          <w:u w:val="none"/>
+        </w:rPr>
+        <w:t>G: ⓓ</w:t>
+      </w:r>
+      <w:r>
+        <w:rPr>
+          <w:b w:val="0"/>
+          <w:i w:val="0"/>
+          <w:sz w:val="20"/>
+          <w:u w:val="single"/>
+        </w:rPr>
+        <w:t>Try a cherry soda.</w:t>
+      </w:r>
+      <w:r>
+        <w:rPr>
+          <w:b w:val="0"/>
+          <w:i w:val="0"/>
+          <w:sz w:val="20"/>
+          <w:u w:val="none"/>
+        </w:rPr>
+        <w:t xml:space="preserve"> The cherry soda here is good.</w:t>
+      </w:r>
+      <w:r>
+        <w:br/>
+      </w:r>
+      <w:r>
+        <w:rPr>
+          <w:b w:val="0"/>
+          <w:i w:val="0"/>
+          <w:sz w:val="20"/>
+          <w:u w:val="none"/>
+        </w:rPr>
+        <w:t>B: ⓔ</w:t>
+      </w:r>
+      <w:r>
+        <w:rPr>
+          <w:b w:val="0"/>
+          <w:i w:val="0"/>
+          <w:sz w:val="20"/>
+          <w:u w:val="single"/>
+        </w:rPr>
+        <w:t>OK. I'll give it a try, then.</w:t>
       </w:r>
     </w:p>
     <w:p>
@@ -1748,7 +2087,7 @@
           <w:sz w:val="20"/>
           <w:u w:val="none"/>
         </w:rPr>
-        <w:t>① try    ② test    ③ way    ④ time    ⑤ chance</w:t>
+        <w:t>① ⓐ    ② ⓑ    ③ ⓒ    ④ ⓓ    ⑤ ⓔ</w:t>
       </w:r>
     </w:p>
     <w:p>
@@ -1763,7 +2102,7 @@
           <w:sz w:val="20"/>
           <w:u w:val="none"/>
         </w:rPr>
-        <w:t xml:space="preserve">16. </w:t>
+        <w:t xml:space="preserve">14. </w:t>
       </w:r>
       <w:r>
         <w:rPr>
@@ -1772,7 +2111,7 @@
           <w:sz w:val="20"/>
           <w:u w:val="none"/>
         </w:rPr>
-        <w:t xml:space="preserve">다음 우리말에 맞게 영작하시오. </w:t>
+        <w:t xml:space="preserve">다음 대화의 빈칸 ⓐ, ⓑ에 들어갈 말이 바르게 짝지어진 것은? </w:t>
       </w:r>
       <w:r>
         <w:rPr>
@@ -1803,12 +2142,66 @@
           <w:sz w:val="20"/>
           <w:u w:val="none"/>
         </w:rPr>
-        <w:t>너는 어떤 종류의 음악을 좋아하니? (kinds)</w:t>
+        <w:t>B: What kinds of magazines do you have?</w:t>
+      </w:r>
+      <w:r>
+        <w:br/>
+      </w:r>
+      <w:r>
+        <w:rPr>
+          <w:b w:val="0"/>
+          <w:i w:val="0"/>
+          <w:sz w:val="20"/>
+          <w:u w:val="none"/>
+        </w:rPr>
+        <w:t>G: We have ⓐ__________ magazines.</w:t>
+      </w:r>
+      <w:r>
+        <w:br/>
+      </w:r>
+      <w:r>
+        <w:rPr>
+          <w:b w:val="0"/>
+          <w:i w:val="0"/>
+          <w:sz w:val="20"/>
+          <w:u w:val="none"/>
+        </w:rPr>
+        <w:t>B: I'm really ⓑ__________ science. Can you recommend a science magazine for me?</w:t>
+      </w:r>
+      <w:r>
+        <w:br/>
+      </w:r>
+      <w:r>
+        <w:rPr>
+          <w:b w:val="0"/>
+          <w:i w:val="0"/>
+          <w:sz w:val="20"/>
+          <w:u w:val="none"/>
+        </w:rPr>
+        <w:t xml:space="preserve">G: Sure. You'll love this one, </w:t>
+      </w:r>
+      <w:r>
+        <w:rPr>
+          <w:b w:val="0"/>
+          <w:i/>
+          <w:sz w:val="20"/>
+          <w:u w:val="none"/>
+        </w:rPr>
+        <w:t>Teen's Science</w:t>
+      </w:r>
+      <w:r>
+        <w:rPr>
+          <w:b w:val="0"/>
+          <w:i w:val="0"/>
+          <w:sz w:val="20"/>
+          <w:u w:val="none"/>
+        </w:rPr>
+        <w:t>.</w:t>
       </w:r>
     </w:p>
     <w:p>
       <w:pPr>
-        <w:spacing w:after="30"/>
+        <w:spacing w:after="10"/>
         <w:ind w:left="170"/>
       </w:pPr>
       <w:r>
@@ -1818,7 +2211,67 @@
           <w:sz w:val="20"/>
           <w:u w:val="none"/>
         </w:rPr>
-        <w:t>→ ________________________________</w:t>
+        <w:t>① all kinds of — interested in</w:t>
+      </w:r>
+    </w:p>
+    <w:p>
+      <w:pPr>
+        <w:spacing w:after="10"/>
+        <w:ind w:left="170"/>
+      </w:pPr>
+      <w:r>
+        <w:rPr>
+          <w:b w:val="0"/>
+          <w:i w:val="0"/>
+          <w:sz w:val="20"/>
+          <w:u w:val="none"/>
+        </w:rPr>
+        <w:t>② all kind of — interesting in</w:t>
+      </w:r>
+    </w:p>
+    <w:p>
+      <w:pPr>
+        <w:spacing w:after="10"/>
+        <w:ind w:left="170"/>
+      </w:pPr>
+      <w:r>
+        <w:rPr>
+          <w:b w:val="0"/>
+          <w:i w:val="0"/>
+          <w:sz w:val="20"/>
+          <w:u w:val="none"/>
+        </w:rPr>
+        <w:t>③ what kinds of — interested in</w:t>
+      </w:r>
+    </w:p>
+    <w:p>
+      <w:pPr>
+        <w:spacing w:after="10"/>
+        <w:ind w:left="170"/>
+      </w:pPr>
+      <w:r>
+        <w:rPr>
+          <w:b w:val="0"/>
+          <w:i w:val="0"/>
+          <w:sz w:val="20"/>
+          <w:u w:val="none"/>
+        </w:rPr>
+        <w:t>④ all kinds of — interesting in</w:t>
+      </w:r>
+    </w:p>
+    <w:p>
+      <w:pPr>
+        <w:spacing w:after="10"/>
+        <w:ind w:left="170"/>
+      </w:pPr>
+      <w:r>
+        <w:rPr>
+          <w:b w:val="0"/>
+          <w:i w:val="0"/>
+          <w:sz w:val="20"/>
+          <w:u w:val="none"/>
+        </w:rPr>
+        <w:t>⑤ any kind — interested on</w:t>
       </w:r>
     </w:p>
     <w:p>
@@ -1833,7 +2286,7 @@
           <w:sz w:val="20"/>
           <w:u w:val="none"/>
         </w:rPr>
-        <w:t xml:space="preserve">17. </w:t>
+        <w:t xml:space="preserve">15. </w:t>
       </w:r>
       <w:r>
         <w:rPr>
@@ -1842,7 +2295,16 @@
           <w:sz w:val="20"/>
           <w:u w:val="none"/>
         </w:rPr>
-        <w:t xml:space="preserve">다음 〈조건〉에 맞게 대답을 완성하시오. </w:t>
+        <w:t xml:space="preserve">다음 중 두 사람의 대화가 </w:t>
+      </w:r>
+      <w:r>
+        <w:rPr>
+          <w:b/>
+          <w:i w:val="0"/>
+          <w:sz w:val="20"/>
+          <w:u w:val="none"/>
+        </w:rPr>
+        <w:t>어색한</w:t>
       </w:r>
       <w:r>
         <w:rPr>
@@ -1851,7 +2313,256 @@
           <w:sz w:val="20"/>
           <w:u w:val="none"/>
         </w:rPr>
+        <w:t xml:space="preserve"> 것을 </w:t>
+      </w:r>
+      <w:r>
+        <w:rPr>
+          <w:b/>
+          <w:i w:val="0"/>
+          <w:sz w:val="20"/>
+          <w:u w:val="none"/>
+        </w:rPr>
+        <w:t>있는 대로</w:t>
+      </w:r>
+      <w:r>
+        <w:rPr>
+          <w:b w:val="0"/>
+          <w:i w:val="0"/>
+          <w:sz w:val="20"/>
+          <w:u w:val="none"/>
+        </w:rPr>
+        <w:t xml:space="preserve"> 고르면? </w:t>
+      </w:r>
+      <w:r>
+        <w:rPr>
+          <w:b w:val="0"/>
+          <w:i w:val="0"/>
+          <w:sz w:val="20"/>
+          <w:u w:val="none"/>
+        </w:rPr>
         <w:t>(4점)</w:t>
+      </w:r>
+    </w:p>
+    <w:p>
+      <w:pPr>
+        <w:spacing w:after="10"/>
+        <w:ind w:left="170"/>
+      </w:pPr>
+      <w:r>
+        <w:rPr>
+          <w:b w:val="0"/>
+          <w:i w:val="0"/>
+          <w:sz w:val="20"/>
+          <w:u w:val="none"/>
+        </w:rPr>
+        <w:t>① A: What kinds of movies do you like?</w:t>
+      </w:r>
+      <w:r>
+        <w:br/>
+      </w:r>
+      <w:r>
+        <w:rPr>
+          <w:b w:val="0"/>
+          <w:i w:val="0"/>
+          <w:sz w:val="20"/>
+          <w:u w:val="none"/>
+        </w:rPr>
+        <w:t xml:space="preserve"> B: I like action movies. </w:t>
+      </w:r>
+      <w:r>
+        <w:rPr>
+          <w:b w:val="0"/>
+          <w:i/>
+          <w:sz w:val="20"/>
+          <w:u w:val="none"/>
+        </w:rPr>
+        <w:t>Spider-Man</w:t>
+      </w:r>
+      <w:r>
+        <w:rPr>
+          <w:b w:val="0"/>
+          <w:i w:val="0"/>
+          <w:sz w:val="20"/>
+          <w:u w:val="none"/>
+        </w:rPr>
+        <w:t xml:space="preserve"> is my favorite.</w:t>
+      </w:r>
+    </w:p>
+    <w:p>
+      <w:pPr>
+        <w:spacing w:after="10"/>
+        <w:ind w:left="170"/>
+      </w:pPr>
+      <w:r>
+        <w:rPr>
+          <w:b w:val="0"/>
+          <w:i w:val="0"/>
+          <w:sz w:val="20"/>
+          <w:u w:val="none"/>
+        </w:rPr>
+        <w:t>② A: Can you recommend a good sci-fi novel for me?</w:t>
+      </w:r>
+      <w:r>
+        <w:br/>
+      </w:r>
+      <w:r>
+        <w:rPr>
+          <w:b w:val="0"/>
+          <w:i w:val="0"/>
+          <w:sz w:val="20"/>
+          <w:u w:val="none"/>
+        </w:rPr>
+        <w:t xml:space="preserve"> B: Yes, I usually read sci-fi novels.</w:t>
+      </w:r>
+    </w:p>
+    <w:p>
+      <w:pPr>
+        <w:spacing w:after="10"/>
+        <w:ind w:left="170"/>
+      </w:pPr>
+      <w:r>
+        <w:rPr>
+          <w:b w:val="0"/>
+          <w:i w:val="0"/>
+          <w:sz w:val="20"/>
+          <w:u w:val="none"/>
+        </w:rPr>
+        <w:t>③ A: How long will it take?</w:t>
+      </w:r>
+      <w:r>
+        <w:br/>
+      </w:r>
+      <w:r>
+        <w:rPr>
+          <w:b w:val="0"/>
+          <w:i w:val="0"/>
+          <w:sz w:val="20"/>
+          <w:u w:val="none"/>
+        </w:rPr>
+        <w:t xml:space="preserve"> B: It's about 500 meters from here.</w:t>
+      </w:r>
+    </w:p>
+    <w:p>
+      <w:pPr>
+        <w:spacing w:after="10"/>
+        <w:ind w:left="170"/>
+      </w:pPr>
+      <w:r>
+        <w:rPr>
+          <w:b w:val="0"/>
+          <w:i w:val="0"/>
+          <w:sz w:val="20"/>
+          <w:u w:val="none"/>
+        </w:rPr>
+        <w:t xml:space="preserve">④ A: Oh, I didn't see </w:t>
+      </w:r>
+      <w:r>
+        <w:rPr>
+          <w:b w:val="0"/>
+          <w:i/>
+          <w:sz w:val="20"/>
+          <w:u w:val="none"/>
+        </w:rPr>
+        <w:t>Spider-Man</w:t>
+      </w:r>
+      <w:r>
+        <w:rPr>
+          <w:b w:val="0"/>
+          <w:i w:val="0"/>
+          <w:sz w:val="20"/>
+          <w:u w:val="none"/>
+        </w:rPr>
+        <w:t>.</w:t>
+      </w:r>
+      <w:r>
+        <w:br/>
+      </w:r>
+      <w:r>
+        <w:rPr>
+          <w:b w:val="0"/>
+          <w:i w:val="0"/>
+          <w:sz w:val="20"/>
+          <w:u w:val="none"/>
+        </w:rPr>
+        <w:t xml:space="preserve"> B: You didn't? It's really fun. I strongly recommend it.</w:t>
+      </w:r>
+    </w:p>
+    <w:p>
+      <w:pPr>
+        <w:spacing w:after="10"/>
+        <w:ind w:left="170"/>
+      </w:pPr>
+      <w:r>
+        <w:rPr>
+          <w:b w:val="0"/>
+          <w:i w:val="0"/>
+          <w:sz w:val="20"/>
+          <w:u w:val="none"/>
+        </w:rPr>
+        <w:t>⑤ A: Why don't you take a taxi?</w:t>
+      </w:r>
+      <w:r>
+        <w:br/>
+      </w:r>
+      <w:r>
+        <w:rPr>
+          <w:b w:val="0"/>
+          <w:i w:val="0"/>
+          <w:sz w:val="20"/>
+          <w:u w:val="none"/>
+        </w:rPr>
+        <w:t xml:space="preserve"> B: Because it's not far.</w:t>
+      </w:r>
+    </w:p>
+    <w:p>
+      <w:pPr>
+        <w:spacing w:after="20" w:before="50"/>
+      </w:pPr>
+      <w:r>
+        <w:rPr>
+          <w:b/>
+          <w:i w:val="0"/>
+          <w:color w:val="1F3864"/>
+          <w:sz w:val="20"/>
+          <w:u w:val="none"/>
+        </w:rPr>
+        <w:t xml:space="preserve">16. </w:t>
+      </w:r>
+      <w:r>
+        <w:rPr>
+          <w:b w:val="0"/>
+          <w:i w:val="0"/>
+          <w:sz w:val="20"/>
+          <w:u w:val="none"/>
+        </w:rPr>
+        <w:t xml:space="preserve">다음 대화를 읽고 답할 수 </w:t>
+      </w:r>
+      <w:r>
+        <w:rPr>
+          <w:b/>
+          <w:i w:val="0"/>
+          <w:sz w:val="20"/>
+          <w:u w:val="none"/>
+        </w:rPr>
+        <w:t>있는</w:t>
+      </w:r>
+      <w:r>
+        <w:rPr>
+          <w:b w:val="0"/>
+          <w:i w:val="0"/>
+          <w:sz w:val="20"/>
+          <w:u w:val="none"/>
+        </w:rPr>
+        <w:t xml:space="preserve"> 질문은? </w:t>
+      </w:r>
+      <w:r>
+        <w:rPr>
+          <w:b w:val="0"/>
+          <w:i w:val="0"/>
+          <w:sz w:val="20"/>
+          <w:u w:val="none"/>
+        </w:rPr>
+        <w:t>(3점)</w:t>
       </w:r>
     </w:p>
     <w:p>
@@ -1873,7 +2584,7 @@
           <w:sz w:val="20"/>
           <w:u w:val="none"/>
         </w:rPr>
-        <w:t>A: Can you recommend an action movie for me?</w:t>
+        <w:t>B: What kinds of movies do you like?</w:t>
       </w:r>
       <w:r>
         <w:br/>
@@ -1885,12 +2596,54 @@
           <w:sz w:val="20"/>
           <w:u w:val="none"/>
         </w:rPr>
-        <w:t>B: ________________ (조건: recommend와 strongly를 쓸 것, Spider-Man)</w:t>
+        <w:t xml:space="preserve">G: I like action movies. </w:t>
+      </w:r>
+      <w:r>
+        <w:rPr>
+          <w:b w:val="0"/>
+          <w:i/>
+          <w:sz w:val="20"/>
+          <w:u w:val="none"/>
+        </w:rPr>
+        <w:t>Spider-Man</w:t>
+      </w:r>
+      <w:r>
+        <w:rPr>
+          <w:b w:val="0"/>
+          <w:i w:val="0"/>
+          <w:sz w:val="20"/>
+          <w:u w:val="none"/>
+        </w:rPr>
+        <w:t xml:space="preserve"> is my favorite.</w:t>
+      </w:r>
+      <w:r>
+        <w:br/>
+      </w:r>
+      <w:r>
+        <w:rPr>
+          <w:b w:val="0"/>
+          <w:i w:val="0"/>
+          <w:sz w:val="20"/>
+          <w:u w:val="none"/>
+        </w:rPr>
+        <w:t>B: Oh, I didn't see it.</w:t>
+      </w:r>
+      <w:r>
+        <w:br/>
+      </w:r>
+      <w:r>
+        <w:rPr>
+          <w:b w:val="0"/>
+          <w:i w:val="0"/>
+          <w:sz w:val="20"/>
+          <w:u w:val="none"/>
+        </w:rPr>
+        <w:t>G: You didn't? It's really fun. I strongly recommend it.</w:t>
       </w:r>
     </w:p>
     <w:p>
       <w:pPr>
-        <w:spacing w:after="30"/>
+        <w:spacing w:after="10"/>
         <w:ind w:left="170"/>
       </w:pPr>
       <w:r>
@@ -1900,22 +2653,103 @@
           <w:sz w:val="20"/>
           <w:u w:val="none"/>
         </w:rPr>
-        <w:t>→ ________________________________</w:t>
+        <w:t xml:space="preserve">① When did G see </w:t>
+      </w:r>
+      <w:r>
+        <w:rPr>
+          <w:b w:val="0"/>
+          <w:i/>
+          <w:sz w:val="20"/>
+          <w:u w:val="none"/>
+        </w:rPr>
+        <w:t>Spider-Man</w:t>
+      </w:r>
+      <w:r>
+        <w:rPr>
+          <w:b w:val="0"/>
+          <w:i w:val="0"/>
+          <w:sz w:val="20"/>
+          <w:u w:val="none"/>
+        </w:rPr>
+        <w:t>?</w:t>
       </w:r>
     </w:p>
     <w:p>
       <w:pPr>
-        <w:spacing w:after="30" w:before="100"/>
+        <w:spacing w:after="10"/>
+        <w:ind w:left="170"/>
       </w:pPr>
       <w:r>
         <w:rPr>
-          <w:b/>
-          <w:i w:val="0"/>
-          <w:color w:val="1F3864"/>
-          <w:sz w:val="21"/>
-          <w:u w:val="none"/>
-        </w:rPr>
-        <w:t>■ [18~20] 종합</w:t>
+          <w:b w:val="0"/>
+          <w:i w:val="0"/>
+          <w:sz w:val="20"/>
+          <w:u w:val="none"/>
+        </w:rPr>
+        <w:t>② Who is G's favorite actor?</w:t>
+      </w:r>
+    </w:p>
+    <w:p>
+      <w:pPr>
+        <w:spacing w:after="10"/>
+        <w:ind w:left="170"/>
+      </w:pPr>
+      <w:r>
+        <w:rPr>
+          <w:b w:val="0"/>
+          <w:i w:val="0"/>
+          <w:sz w:val="20"/>
+          <w:u w:val="none"/>
+        </w:rPr>
+        <w:t>③ What kind of movies does G like?</w:t>
+      </w:r>
+    </w:p>
+    <w:p>
+      <w:pPr>
+        <w:spacing w:after="10"/>
+        <w:ind w:left="170"/>
+      </w:pPr>
+      <w:r>
+        <w:rPr>
+          <w:b w:val="0"/>
+          <w:i w:val="0"/>
+          <w:sz w:val="20"/>
+          <w:u w:val="none"/>
+        </w:rPr>
+        <w:t xml:space="preserve">④ Why didn't B see </w:t>
+      </w:r>
+      <w:r>
+        <w:rPr>
+          <w:b w:val="0"/>
+          <w:i/>
+          <w:sz w:val="20"/>
+          <w:u w:val="none"/>
+        </w:rPr>
+        <w:t>Spider-Man</w:t>
+      </w:r>
+      <w:r>
+        <w:rPr>
+          <w:b w:val="0"/>
+          <w:i w:val="0"/>
+          <w:sz w:val="20"/>
+          <w:u w:val="none"/>
+        </w:rPr>
+        <w:t>?</w:t>
+      </w:r>
+    </w:p>
+    <w:p>
+      <w:pPr>
+        <w:spacing w:after="10"/>
+        <w:ind w:left="170"/>
+      </w:pPr>
+      <w:r>
+        <w:rPr>
+          <w:b w:val="0"/>
+          <w:i w:val="0"/>
+          <w:sz w:val="20"/>
+          <w:u w:val="none"/>
+        </w:rPr>
+        <w:t>⑤ What kind of movies does B like?</w:t>
       </w:r>
     </w:p>
     <w:p>
@@ -1930,7 +2764,7 @@
           <w:sz w:val="20"/>
           <w:u w:val="none"/>
         </w:rPr>
-        <w:t xml:space="preserve">18. </w:t>
+        <w:t xml:space="preserve">17. </w:t>
       </w:r>
       <w:r>
         <w:rPr>
@@ -1939,7 +2773,16 @@
           <w:sz w:val="20"/>
           <w:u w:val="none"/>
         </w:rPr>
-        <w:t xml:space="preserve">다음 대화에서 어색한 부분을 찾아 바르게 고쳐 쓰시오. </w:t>
+        <w:t xml:space="preserve">다음 대화의 빈칸에 들어갈 말로 알맞지 </w:t>
+      </w:r>
+      <w:r>
+        <w:rPr>
+          <w:b/>
+          <w:i w:val="0"/>
+          <w:sz w:val="20"/>
+          <w:u w:val="none"/>
+        </w:rPr>
+        <w:t>않은</w:t>
       </w:r>
       <w:r>
         <w:rPr>
@@ -1948,7 +2791,16 @@
           <w:sz w:val="20"/>
           <w:u w:val="none"/>
         </w:rPr>
-        <w:t>(4점)</w:t>
+        <w:t xml:space="preserve"> 것은? </w:t>
+      </w:r>
+      <w:r>
+        <w:rPr>
+          <w:b w:val="0"/>
+          <w:i w:val="0"/>
+          <w:sz w:val="20"/>
+          <w:u w:val="none"/>
+        </w:rPr>
+        <w:t>(3점)</w:t>
       </w:r>
     </w:p>
     <w:p>
@@ -1970,7 +2822,7 @@
           <w:sz w:val="20"/>
           <w:u w:val="none"/>
         </w:rPr>
-        <w:t>A: How long will it take by bus?</w:t>
+        <w:t>B: What kinds of books do you usually read?</w:t>
       </w:r>
       <w:r>
         <w:br/>
@@ -1982,14 +2834,11 @@
           <w:sz w:val="20"/>
           <w:u w:val="none"/>
         </w:rPr>
-        <w:t>B: Not very long. It'll take less than 10 meters.</w:t>
-      </w:r>
-    </w:p>
-    <w:p>
-      <w:pPr>
-        <w:spacing w:after="30"/>
-        <w:ind w:left="170"/>
-      </w:pPr>
+        <w:t>G: I usually read sci-fi novels.</w:t>
+      </w:r>
+      <w:r>
+        <w:br/>
+      </w:r>
       <w:r>
         <w:rPr>
           <w:b w:val="0"/>
@@ -1997,58 +2846,19 @@
           <w:sz w:val="20"/>
           <w:u w:val="none"/>
         </w:rPr>
-        <w:t>______ → ______</w:t>
-      </w:r>
-    </w:p>
-    <w:p>
-      <w:pPr>
-        <w:spacing w:after="20" w:before="50"/>
-      </w:pPr>
-      <w:r>
-        <w:rPr>
-          <w:b/>
-          <w:i w:val="0"/>
-          <w:color w:val="1F3864"/>
+        <w:t>B: Then, can you recommend a good sci-fi novel for me?</w:t>
+      </w:r>
+      <w:r>
+        <w:br/>
+      </w:r>
+      <w:r>
+        <w:rPr>
+          <w:b w:val="0"/>
+          <w:i w:val="0"/>
           <w:sz w:val="20"/>
           <w:u w:val="none"/>
         </w:rPr>
-        <w:t xml:space="preserve">19. </w:t>
-      </w:r>
-      <w:r>
-        <w:rPr>
-          <w:b w:val="0"/>
-          <w:i w:val="0"/>
-          <w:sz w:val="20"/>
-          <w:u w:val="none"/>
-        </w:rPr>
-        <w:t xml:space="preserve">다음 중 의사소통 기능과 표현의 연결이 </w:t>
-      </w:r>
-      <w:r>
-        <w:rPr>
-          <w:b/>
-          <w:i w:val="0"/>
-          <w:sz w:val="20"/>
-          <w:u w:val="none"/>
-        </w:rPr>
-        <w:t>잘못된</w:t>
-      </w:r>
-      <w:r>
-        <w:rPr>
-          <w:b w:val="0"/>
-          <w:i w:val="0"/>
-          <w:sz w:val="20"/>
-          <w:u w:val="none"/>
-        </w:rPr>
-        <w:t xml:space="preserve"> 것은? </w:t>
-      </w:r>
-      <w:r>
-        <w:rPr>
-          <w:b w:val="0"/>
-          <w:i w:val="0"/>
-          <w:sz w:val="20"/>
-          <w:u w:val="none"/>
-        </w:rPr>
-        <w:t>(3점)</w:t>
+        <w:t>G: ______________________________ I think it's the best.</w:t>
       </w:r>
     </w:p>
     <w:p>
@@ -2063,7 +2873,25 @@
           <w:sz w:val="20"/>
           <w:u w:val="none"/>
         </w:rPr>
-        <w:t>① 길 묻기 – How can I get to the station?</w:t>
+        <w:t xml:space="preserve">① How about </w:t>
+      </w:r>
+      <w:r>
+        <w:rPr>
+          <w:b w:val="0"/>
+          <w:i/>
+          <w:sz w:val="20"/>
+          <w:u w:val="none"/>
+        </w:rPr>
+        <w:t>The Time Machine</w:t>
+      </w:r>
+      <w:r>
+        <w:rPr>
+          <w:b w:val="0"/>
+          <w:i w:val="0"/>
+          <w:sz w:val="20"/>
+          <w:u w:val="none"/>
+        </w:rPr>
+        <w:t>?</w:t>
       </w:r>
     </w:p>
     <w:p>
@@ -2078,7 +2906,25 @@
           <w:sz w:val="20"/>
           <w:u w:val="none"/>
         </w:rPr>
-        <w:t>② 소요 시간 묻기 – How long will it take?</w:t>
+        <w:t xml:space="preserve">② What about </w:t>
+      </w:r>
+      <w:r>
+        <w:rPr>
+          <w:b w:val="0"/>
+          <w:i/>
+          <w:sz w:val="20"/>
+          <w:u w:val="none"/>
+        </w:rPr>
+        <w:t>The Time Machine</w:t>
+      </w:r>
+      <w:r>
+        <w:rPr>
+          <w:b w:val="0"/>
+          <w:i w:val="0"/>
+          <w:sz w:val="20"/>
+          <w:u w:val="none"/>
+        </w:rPr>
+        <w:t>?</w:t>
       </w:r>
     </w:p>
     <w:p>
@@ -2093,7 +2939,25 @@
           <w:sz w:val="20"/>
           <w:u w:val="none"/>
         </w:rPr>
-        <w:t>③ 종류 묻기 – What kinds of books do you read?</w:t>
+        <w:t xml:space="preserve">③ I recommend </w:t>
+      </w:r>
+      <w:r>
+        <w:rPr>
+          <w:b w:val="0"/>
+          <w:i/>
+          <w:sz w:val="20"/>
+          <w:u w:val="none"/>
+        </w:rPr>
+        <w:t>The Time Machine</w:t>
+      </w:r>
+      <w:r>
+        <w:rPr>
+          <w:b w:val="0"/>
+          <w:i w:val="0"/>
+          <w:sz w:val="20"/>
+          <w:u w:val="none"/>
+        </w:rPr>
+        <w:t>.</w:t>
       </w:r>
     </w:p>
     <w:p>
@@ -2108,7 +2972,25 @@
           <w:sz w:val="20"/>
           <w:u w:val="none"/>
         </w:rPr>
-        <w:t>④ 추천 요청 – Can you recommend a novel?</w:t>
+        <w:t xml:space="preserve">④ Try </w:t>
+      </w:r>
+      <w:r>
+        <w:rPr>
+          <w:b w:val="0"/>
+          <w:i/>
+          <w:sz w:val="20"/>
+          <w:u w:val="none"/>
+        </w:rPr>
+        <w:t>The Time Machine</w:t>
+      </w:r>
+      <w:r>
+        <w:rPr>
+          <w:b w:val="0"/>
+          <w:i w:val="0"/>
+          <w:sz w:val="20"/>
+          <w:u w:val="none"/>
+        </w:rPr>
+        <w:t>.</w:t>
       </w:r>
     </w:p>
     <w:p>
@@ -2123,7 +3005,25 @@
           <w:sz w:val="20"/>
           <w:u w:val="none"/>
         </w:rPr>
-        <w:t>⑤ 추천하기 – How often do you read?</w:t>
+        <w:t xml:space="preserve">⑤ Can you recommend </w:t>
+      </w:r>
+      <w:r>
+        <w:rPr>
+          <w:b w:val="0"/>
+          <w:i/>
+          <w:sz w:val="20"/>
+          <w:u w:val="none"/>
+        </w:rPr>
+        <w:t>The Time Machine</w:t>
+      </w:r>
+      <w:r>
+        <w:rPr>
+          <w:b w:val="0"/>
+          <w:i w:val="0"/>
+          <w:sz w:val="20"/>
+          <w:u w:val="none"/>
+        </w:rPr>
+        <w:t>?</w:t>
       </w:r>
     </w:p>
     <w:p>
@@ -2138,7 +3038,7 @@
           <w:sz w:val="20"/>
           <w:u w:val="none"/>
         </w:rPr>
-        <w:t xml:space="preserve">20. </w:t>
+        <w:t xml:space="preserve">18. </w:t>
       </w:r>
       <w:r>
         <w:rPr>
@@ -2147,7 +3047,25 @@
           <w:sz w:val="20"/>
           <w:u w:val="none"/>
         </w:rPr>
-        <w:t xml:space="preserve">다음 대화의 빈칸에 알맞은 말은? </w:t>
+        <w:t xml:space="preserve">다음 대화에서 어법상 </w:t>
+      </w:r>
+      <w:r>
+        <w:rPr>
+          <w:b/>
+          <w:i w:val="0"/>
+          <w:sz w:val="20"/>
+          <w:u w:val="none"/>
+        </w:rPr>
+        <w:t>틀린</w:t>
+      </w:r>
+      <w:r>
+        <w:rPr>
+          <w:b w:val="0"/>
+          <w:i w:val="0"/>
+          <w:sz w:val="20"/>
+          <w:u w:val="none"/>
+        </w:rPr>
+        <w:t xml:space="preserve"> 부분을 하나 찾아 바르게 고쳐 쓰시오. </w:t>
       </w:r>
       <w:r>
         <w:rPr>
@@ -2178,7 +3096,7 @@
           <w:sz w:val="20"/>
           <w:u w:val="none"/>
         </w:rPr>
-        <w:t>A: I'm really interested in science. Can you recommend a science magazine for me?</w:t>
+        <w:t>G: What kinds of soft drinks do you usually have?</w:t>
       </w:r>
       <w:r>
         <w:br/>
@@ -2190,7 +3108,31 @@
           <w:sz w:val="20"/>
           <w:u w:val="none"/>
         </w:rPr>
-        <w:t>B: ________. You'll love this one, Teen's Science.</w:t>
+        <w:t>B: I usually drink apple soda, but today, I want to try something else. Can you recommend some new soft drinks?</w:t>
+      </w:r>
+      <w:r>
+        <w:br/>
+      </w:r>
+      <w:r>
+        <w:rPr>
+          <w:b w:val="0"/>
+          <w:i w:val="0"/>
+          <w:sz w:val="20"/>
+          <w:u w:val="none"/>
+        </w:rPr>
+        <w:t>G: Try a cherry soda. The cherry soda here is good.</w:t>
+      </w:r>
+      <w:r>
+        <w:br/>
+      </w:r>
+      <w:r>
+        <w:rPr>
+          <w:b w:val="0"/>
+          <w:i w:val="0"/>
+          <w:sz w:val="20"/>
+          <w:u w:val="none"/>
+        </w:rPr>
+        <w:t>B: OK. I'll give a try it, then.</w:t>
       </w:r>
     </w:p>
     <w:p>
@@ -2205,7 +3147,293 @@
           <w:sz w:val="20"/>
           <w:u w:val="none"/>
         </w:rPr>
-        <w:t>① Sure    ② No way    ③ I'm sorry    ④ Not at all    ⑤ Never</w:t>
+        <w:t>틀린 부분: ______________ → 고친 것: ______________</w:t>
+      </w:r>
+    </w:p>
+    <w:p>
+      <w:pPr>
+        <w:spacing w:after="30" w:before="100"/>
+      </w:pPr>
+      <w:r>
+        <w:rPr>
+          <w:b/>
+          <w:i w:val="0"/>
+          <w:color w:val="1F3864"/>
+          <w:sz w:val="21"/>
+          <w:u w:val="none"/>
+        </w:rPr>
+        <w:t>■ [19~20] 다음 글을 읽고 물음에 답하시오. (L6 Listen Up)</w:t>
+      </w:r>
+    </w:p>
+    <w:p>
+      <w:pPr>
+        <w:spacing w:after="60"/>
+        <w:pBdr>
+          <w:top w:val="single" w:sz="4" w:space="3" w:color="9AA9C2"/>
+          <w:left w:val="single" w:sz="4" w:space="3" w:color="9AA9C2"/>
+          <w:bottom w:val="single" w:sz="4" w:space="3" w:color="9AA9C2"/>
+          <w:right w:val="single" w:sz="4" w:space="3" w:color="9AA9C2"/>
+        </w:pBdr>
+        <w:ind w:left="57" w:right="57"/>
+      </w:pPr>
+      <w:r>
+        <w:rPr>
+          <w:b w:val="0"/>
+          <w:i w:val="0"/>
+          <w:sz w:val="20"/>
+          <w:u w:val="none"/>
+        </w:rPr>
+        <w:t xml:space="preserve">W: Hello, everyone. The movie I'm going to introduce today is </w:t>
+      </w:r>
+      <w:r>
+        <w:rPr>
+          <w:b w:val="0"/>
+          <w:i/>
+          <w:sz w:val="20"/>
+          <w:u w:val="none"/>
+        </w:rPr>
+        <w:t>The Song of Love</w:t>
+      </w:r>
+      <w:r>
+        <w:rPr>
+          <w:b w:val="0"/>
+          <w:i w:val="0"/>
+          <w:sz w:val="20"/>
+          <w:u w:val="none"/>
+        </w:rPr>
+        <w:t xml:space="preserve">. </w:t>
+      </w:r>
+      <w:r>
+        <w:rPr>
+          <w:b/>
+          <w:i w:val="0"/>
+          <w:sz w:val="20"/>
+          <w:u w:val="none"/>
+        </w:rPr>
+        <w:t>(A)</w:t>
+      </w:r>
+      <w:r>
+        <w:rPr>
+          <w:b w:val="0"/>
+          <w:i w:val="0"/>
+          <w:sz w:val="20"/>
+          <w:u w:val="none"/>
+        </w:rPr>
+        <w:t xml:space="preserve"> </w:t>
+      </w:r>
+      <w:r>
+        <w:rPr>
+          <w:b w:val="0"/>
+          <w:i w:val="0"/>
+          <w:sz w:val="20"/>
+          <w:u w:val="single"/>
+        </w:rPr>
+        <w:t>It's a movie about a pianist. He loses his love for music.</w:t>
+      </w:r>
+      <w:r>
+        <w:rPr>
+          <w:b w:val="0"/>
+          <w:i w:val="0"/>
+          <w:sz w:val="20"/>
+          <w:u w:val="none"/>
+        </w:rPr>
+        <w:t xml:space="preserve"> He moves to a small town for a new start. There, he begins teaching music to children and finds his love for music again. This movie has great music and a touching story, so I strongly recommend it.</w:t>
+      </w:r>
+    </w:p>
+    <w:p>
+      <w:pPr>
+        <w:spacing w:after="20" w:before="50"/>
+      </w:pPr>
+      <w:r>
+        <w:rPr>
+          <w:b/>
+          <w:i w:val="0"/>
+          <w:color w:val="1F3864"/>
+          <w:sz w:val="20"/>
+          <w:u w:val="none"/>
+        </w:rPr>
+        <w:t xml:space="preserve">19. </w:t>
+      </w:r>
+      <w:r>
+        <w:rPr>
+          <w:b w:val="0"/>
+          <w:i w:val="0"/>
+          <w:sz w:val="20"/>
+          <w:u w:val="none"/>
+        </w:rPr>
+        <w:t xml:space="preserve">위 글의 내용과 일치하지 </w:t>
+      </w:r>
+      <w:r>
+        <w:rPr>
+          <w:b/>
+          <w:i w:val="0"/>
+          <w:sz w:val="20"/>
+          <w:u w:val="none"/>
+        </w:rPr>
+        <w:t>않는</w:t>
+      </w:r>
+      <w:r>
+        <w:rPr>
+          <w:b w:val="0"/>
+          <w:i w:val="0"/>
+          <w:sz w:val="20"/>
+          <w:u w:val="none"/>
+        </w:rPr>
+        <w:t xml:space="preserve"> 것은? </w:t>
+      </w:r>
+      <w:r>
+        <w:rPr>
+          <w:b w:val="0"/>
+          <w:i w:val="0"/>
+          <w:sz w:val="20"/>
+          <w:u w:val="none"/>
+        </w:rPr>
+        <w:t>(3점)</w:t>
+      </w:r>
+    </w:p>
+    <w:p>
+      <w:pPr>
+        <w:spacing w:after="10"/>
+        <w:ind w:left="170"/>
+      </w:pPr>
+      <w:r>
+        <w:rPr>
+          <w:b w:val="0"/>
+          <w:i w:val="0"/>
+          <w:sz w:val="20"/>
+          <w:u w:val="none"/>
+        </w:rPr>
+        <w:t>① 소개하는 영화의 제목은 'The Song of Love'이다.</w:t>
+      </w:r>
+    </w:p>
+    <w:p>
+      <w:pPr>
+        <w:spacing w:after="10"/>
+        <w:ind w:left="170"/>
+      </w:pPr>
+      <w:r>
+        <w:rPr>
+          <w:b w:val="0"/>
+          <w:i w:val="0"/>
+          <w:sz w:val="20"/>
+          <w:u w:val="none"/>
+        </w:rPr>
+        <w:t>② 주인공은 음악에 대한 사랑을 잃은 피아니스트이다.</w:t>
+      </w:r>
+    </w:p>
+    <w:p>
+      <w:pPr>
+        <w:spacing w:after="10"/>
+        <w:ind w:left="170"/>
+      </w:pPr>
+      <w:r>
+        <w:rPr>
+          <w:b w:val="0"/>
+          <w:i w:val="0"/>
+          <w:sz w:val="20"/>
+          <w:u w:val="none"/>
+        </w:rPr>
+        <w:t>③ 주인공은 새 출발을 위해 큰 도시로 이사한다.</w:t>
+      </w:r>
+    </w:p>
+    <w:p>
+      <w:pPr>
+        <w:spacing w:after="10"/>
+        <w:ind w:left="170"/>
+      </w:pPr>
+      <w:r>
+        <w:rPr>
+          <w:b w:val="0"/>
+          <w:i w:val="0"/>
+          <w:sz w:val="20"/>
+          <w:u w:val="none"/>
+        </w:rPr>
+        <w:t>④ 주인공은 아이들에게 음악을 가르치며 음악에 대한 사랑을 되찾는다.</w:t>
+      </w:r>
+    </w:p>
+    <w:p>
+      <w:pPr>
+        <w:spacing w:after="10"/>
+        <w:ind w:left="170"/>
+      </w:pPr>
+      <w:r>
+        <w:rPr>
+          <w:b w:val="0"/>
+          <w:i w:val="0"/>
+          <w:sz w:val="20"/>
+          <w:u w:val="none"/>
+        </w:rPr>
+        <w:t>⑤ 말하는 사람은 훌륭한 음악과 감동적인 이야기 때문에 이 영화를 추천한다.</w:t>
+      </w:r>
+    </w:p>
+    <w:p>
+      <w:pPr>
+        <w:spacing w:after="20" w:before="50"/>
+      </w:pPr>
+      <w:r>
+        <w:rPr>
+          <w:b/>
+          <w:i w:val="0"/>
+          <w:color w:val="1F3864"/>
+          <w:sz w:val="20"/>
+          <w:u w:val="none"/>
+        </w:rPr>
+        <w:t xml:space="preserve">20. </w:t>
+      </w:r>
+      <w:r>
+        <w:rPr>
+          <w:b w:val="0"/>
+          <w:i w:val="0"/>
+          <w:sz w:val="20"/>
+          <w:u w:val="none"/>
+        </w:rPr>
+        <w:t xml:space="preserve">위 글의 밑줄 친 (A)의 두 문장을 관계대명사를 이용하여 한 문장으로 연결하시오. </w:t>
+      </w:r>
+      <w:r>
+        <w:rPr>
+          <w:b w:val="0"/>
+          <w:i w:val="0"/>
+          <w:sz w:val="20"/>
+          <w:u w:val="none"/>
+        </w:rPr>
+        <w:t>(4점)</w:t>
+      </w:r>
+    </w:p>
+    <w:p>
+      <w:pPr>
+        <w:spacing w:after="30"/>
+        <w:ind w:left="57" w:right="57"/>
+        <w:pBdr>
+          <w:top w:val="single" w:sz="4" w:space="3" w:color="8DA2C4"/>
+          <w:left w:val="single" w:sz="4" w:space="3" w:color="8DA2C4"/>
+          <w:bottom w:val="single" w:sz="4" w:space="3" w:color="8DA2C4"/>
+          <w:right w:val="single" w:sz="4" w:space="3" w:color="8DA2C4"/>
+        </w:pBdr>
+        <w:shd w:val="clear" w:color="auto" w:fill="F7F9FC"/>
+      </w:pPr>
+      <w:r>
+        <w:rPr>
+          <w:b w:val="0"/>
+          <w:i w:val="0"/>
+          <w:sz w:val="20"/>
+          <w:u w:val="none"/>
+        </w:rPr>
+        <w:t>It's a movie about a pianist. He loses his love for music.</w:t>
+      </w:r>
+    </w:p>
+    <w:p>
+      <w:pPr>
+        <w:spacing w:after="30"/>
+        <w:ind w:left="170"/>
+      </w:pPr>
+      <w:r>
+        <w:rPr>
+          <w:b w:val="0"/>
+          <w:i w:val="0"/>
+          <w:sz w:val="20"/>
+          <w:u w:val="none"/>
+        </w:rPr>
+        <w:t>→ It's a movie about ________________________________________.</w:t>
       </w:r>
     </w:p>
     <w:p>
@@ -2255,7 +3483,7 @@
           <w:sz w:val="18"/>
           <w:u w:val="none"/>
         </w:rPr>
-        <w:t xml:space="preserve"> ②</w:t>
+        <w:t xml:space="preserve"> ①</w:t>
       </w:r>
       <w:r>
         <w:rPr>
@@ -2284,7 +3512,7 @@
           <w:sz w:val="18"/>
           <w:u w:val="none"/>
         </w:rPr>
-        <w:t xml:space="preserve"> ②</w:t>
+        <w:t xml:space="preserve"> ①, ③</w:t>
       </w:r>
       <w:r>
         <w:rPr>
@@ -2313,7 +3541,7 @@
           <w:sz w:val="18"/>
           <w:u w:val="none"/>
         </w:rPr>
-        <w:t xml:space="preserve"> ①, ②</w:t>
+        <w:t xml:space="preserve"> ③</w:t>
       </w:r>
       <w:r>
         <w:rPr>
@@ -2342,7 +3570,7 @@
           <w:sz w:val="18"/>
           <w:u w:val="none"/>
         </w:rPr>
-        <w:t xml:space="preserve"> ③</w:t>
+        <w:t xml:space="preserve"> Because there is an art fair (at Sebit Park) this Saturday.</w:t>
       </w:r>
       <w:r>
         <w:rPr>
@@ -2371,7 +3599,7 @@
           <w:sz w:val="18"/>
           <w:u w:val="none"/>
         </w:rPr>
-        <w:t xml:space="preserve"> You can get there by taxi.</w:t>
+        <w:t xml:space="preserve"> ⑤</w:t>
       </w:r>
       <w:r>
         <w:rPr>
@@ -2400,7 +3628,7 @@
           <w:sz w:val="18"/>
           <w:u w:val="none"/>
         </w:rPr>
-        <w:t xml:space="preserve"> ①</w:t>
+        <w:t xml:space="preserve"> ②</w:t>
       </w:r>
       <w:r>
         <w:rPr>
@@ -2429,7 +3657,7 @@
           <w:sz w:val="18"/>
           <w:u w:val="none"/>
         </w:rPr>
-        <w:t xml:space="preserve"> ①</w:t>
+        <w:t xml:space="preserve"> ③</w:t>
       </w:r>
       <w:r>
         <w:rPr>
@@ -2458,7 +3686,7 @@
           <w:sz w:val="18"/>
           <w:u w:val="none"/>
         </w:rPr>
-        <w:t xml:space="preserve"> ④</w:t>
+        <w:t xml:space="preserve"> ②, ③</w:t>
       </w:r>
       <w:r>
         <w:rPr>
@@ -2516,7 +3744,7 @@
           <w:sz w:val="18"/>
           <w:u w:val="none"/>
         </w:rPr>
-        <w:t xml:space="preserve"> ④, ⑤</w:t>
+        <w:t xml:space="preserve"> ④</w:t>
       </w:r>
       <w:r>
         <w:rPr>
@@ -2545,7 +3773,7 @@
           <w:sz w:val="18"/>
           <w:u w:val="none"/>
         </w:rPr>
-        <w:t xml:space="preserve"> ①</w:t>
+        <w:t xml:space="preserve"> I'm looking for books on famous people who helped others.</w:t>
       </w:r>
       <w:r>
         <w:rPr>
@@ -2574,7 +3802,7 @@
           <w:sz w:val="18"/>
           <w:u w:val="none"/>
         </w:rPr>
-        <w:t xml:space="preserve"> ②</w:t>
+        <w:t xml:space="preserve"> She did a lot of volunteer work, especially for children.</w:t>
       </w:r>
       <w:r>
         <w:rPr>
@@ -2603,7 +3831,7 @@
           <w:sz w:val="18"/>
           <w:u w:val="none"/>
         </w:rPr>
-        <w:t xml:space="preserve"> ③</w:t>
+        <w:t xml:space="preserve"> ②</w:t>
       </w:r>
       <w:r>
         <w:rPr>
@@ -2632,7 +3860,7 @@
           <w:sz w:val="18"/>
           <w:u w:val="none"/>
         </w:rPr>
-        <w:t xml:space="preserve"> ①, ②, ③</w:t>
+        <w:t xml:space="preserve"> ①</w:t>
       </w:r>
       <w:r>
         <w:rPr>
@@ -2661,7 +3889,7 @@
           <w:sz w:val="18"/>
           <w:u w:val="none"/>
         </w:rPr>
-        <w:t xml:space="preserve"> ①</w:t>
+        <w:t xml:space="preserve"> ②, ③, ⑤</w:t>
       </w:r>
       <w:r>
         <w:rPr>
@@ -2690,7 +3918,7 @@
           <w:sz w:val="18"/>
           <w:u w:val="none"/>
         </w:rPr>
-        <w:t xml:space="preserve"> What kinds of music do you like?</w:t>
+        <w:t xml:space="preserve"> ③</w:t>
       </w:r>
       <w:r>
         <w:rPr>
@@ -2719,7 +3947,7 @@
           <w:sz w:val="18"/>
           <w:u w:val="none"/>
         </w:rPr>
-        <w:t xml:space="preserve"> I strongly recommend Spider-Man.</w:t>
+        <w:t xml:space="preserve"> ⑤</w:t>
       </w:r>
       <w:r>
         <w:rPr>
@@ -2748,7 +3976,7 @@
           <w:sz w:val="18"/>
           <w:u w:val="none"/>
         </w:rPr>
-        <w:t xml:space="preserve"> 10 meters → 10 minutes</w:t>
+        <w:t xml:space="preserve"> give a try it → give it a try</w:t>
       </w:r>
       <w:r>
         <w:rPr>
@@ -2777,7 +4005,7 @@
           <w:sz w:val="18"/>
           <w:u w:val="none"/>
         </w:rPr>
-        <w:t xml:space="preserve"> ⑤</w:t>
+        <w:t xml:space="preserve"> ③</w:t>
       </w:r>
       <w:r>
         <w:rPr>
@@ -2806,7 +4034,7 @@
           <w:sz w:val="18"/>
           <w:u w:val="none"/>
         </w:rPr>
-        <w:t xml:space="preserve"> ①</w:t>
+        <w:t xml:space="preserve"> It's a movie about a pianist who loses his love for music.</w:t>
       </w:r>
     </w:p>
     <w:sectPr>

</xml_diff>